<commit_message>
Fix CT-30 restriction scope in Table1/Fig1
</commit_message>
<xml_diff>
--- a/Output/table1.docx
+++ b/Output/table1.docx
@@ -8,6 +8,24 @@
       </w:pPr>
       <w:r>
         <w:t xml:space="preserve"/>
+      </w:r>
+    </w:p>
+    <w:p>
+      <w:pPr>
+        <w:pStyle w:val="TableCaption"/>
+        <w:jc w:val="center"/>
+        <w:keepNext/>
+        <w:pBdr>
+          <w:bottom w:val="none" w:sz="0" w:space="0" w:color="000000"/>
+          <w:top w:val="none" w:sz="0" w:space="0" w:color="000000"/>
+          <w:left w:val="none" w:sz="0" w:space="0" w:color="000000"/>
+          <w:right w:val="none" w:sz="0" w:space="0" w:color="000000"/>
+        </w:pBdr>
+        <w:spacing w:after="60" w:before="60" w:line="240"/>
+        <w:ind w:left="60" w:right="60" w:firstLine="0" w:firstLineChars="0"/>
+      </w:pPr>
+      <w:r>
+        <w:t xml:space="preserve">**Table 1.** All cases are HMPV-positive with HMPV CT ≤ 30; this restriction is applied identically across every column and every design (A/B/C).</w:t>
       </w:r>
     </w:p>
     <w:tbl xmlns:a="http://schemas.openxmlformats.org/drawingml/2006/main" xmlns:pic="http://schemas.openxmlformats.org/drawingml/2006/picture">
@@ -2400,7 +2418,7 @@
                 <w:szCs w:val="22"/>
                 <w:color w:val="000000"/>
               </w:rPr>
-              <w:t xml:space="preserve">0.093</w:t>
+              <w:t xml:space="preserve">0.087</w:t>
             </w:r>
           </w:p>
         </w:tc>
@@ -14895,7 +14913,7 @@
                 <w:szCs w:val="22"/>
                 <w:color w:val="000000"/>
               </w:rPr>
-              <w:t xml:space="preserve">"Excluded (CT)": HMPV CT &gt;30 or missing; or co-detection partner CT &gt;30, missing, or inconclusive. Case dropped entirely (N=266).</w:t>
+              <w:t xml:space="preserve">"Excluded (CT)": co-detection partner CT &gt;30, missing, or inconclusive. Case dropped entirely (N=266). (All cases are already restricted to HMPV CT ≤30; see table caption.)</w:t>
             </w:r>
           </w:p>
         </w:tc>

</xml_diff>

<commit_message>
updated dataset with sflu... CT variables
</commit_message>
<xml_diff>
--- a/Output/table1.docx
+++ b/Output/table1.docx
@@ -297,7 +297,7 @@
                 <w:szCs w:val="22"/>
                 <w:color w:val="000000"/>
               </w:rPr>
-              <w:t xml:space="preserve">N = 1,956</w:t>
+              <w:t xml:space="preserve">N = 1,962</w:t>
             </w:r>
             <w:r>
               <w:rPr>
@@ -404,7 +404,7 @@
                 <w:szCs w:val="22"/>
                 <w:color w:val="000000"/>
               </w:rPr>
-              <w:t xml:space="preserve">N = 266</w:t>
+              <w:t xml:space="preserve">N = 260</w:t>
             </w:r>
             <w:r>
               <w:rPr>
@@ -654,7 +654,7 @@
                 <w:szCs w:val="22"/>
                 <w:color w:val="000000"/>
               </w:rPr>
-              <w:t xml:space="preserve">23 (9, 50)</w:t>
+              <w:t xml:space="preserve">24 (9, 50)</w:t>
             </w:r>
           </w:p>
         </w:tc>
@@ -762,7 +762,7 @@
                 <w:szCs w:val="22"/>
                 <w:color w:val="000000"/>
               </w:rPr>
-              <w:t xml:space="preserve">0.017</w:t>
+              <w:t xml:space="preserve">0.011</w:t>
             </w:r>
           </w:p>
         </w:tc>
@@ -984,7 +984,7 @@
                 <w:szCs w:val="22"/>
                 <w:color w:val="000000"/>
               </w:rPr>
-              <w:t xml:space="preserve">24.8 (22.1, 27.3)</w:t>
+              <w:t xml:space="preserve">24.8 (22.1, 27.2)</w:t>
             </w:r>
           </w:p>
         </w:tc>
@@ -1038,7 +1038,7 @@
                 <w:szCs w:val="22"/>
                 <w:color w:val="000000"/>
               </w:rPr>
-              <w:t xml:space="preserve">0.022</w:t>
+              <w:t xml:space="preserve">0.020</w:t>
             </w:r>
           </w:p>
         </w:tc>
@@ -1314,7 +1314,7 @@
                 <w:szCs w:val="22"/>
                 <w:color w:val="000000"/>
               </w:rPr>
-              <w:t xml:space="preserve">0.9</w:t>
+              <w:t xml:space="preserve">0.6</w:t>
             </w:r>
           </w:p>
         </w:tc>
@@ -1482,61 +1482,61 @@
                 <w:szCs w:val="22"/>
                 <w:color w:val="000000"/>
               </w:rPr>
-              <w:t xml:space="preserve">1,022 (54%)</w:t>
-            </w:r>
-          </w:p>
-        </w:tc>
-        <w:tc>
-          <w:tcPr>
-            <w:tcBorders>
-              <w:bottom w:val="none" w:sz="0" w:space="0" w:color="000000"/>
-              <w:top w:val="none" w:sz="0" w:space="0" w:color="000000"/>
-              <w:left w:val="none" w:sz="0" w:space="0" w:color="000000"/>
-              <w:right w:val="none" w:sz="0" w:space="0" w:color="000000"/>
-            </w:tcBorders>
-            <w:shd w:val="clear" w:color="auto" w:fill="FFFFFF"/>
-            <w:tcMar>
-              <w:top w:w="0" w:type="dxa"/>
-              <w:bottom w:w="0" w:type="dxa"/>
-              <w:left w:w="0" w:type="dxa"/>
-              <w:right w:w="0" w:type="dxa"/>
-            </w:tcMar>
-            <w:vAlign w:val="top"/>
-          </w:tcPr>
-          <w:p>
-            <w:pPr>
-              <w:jc w:val="center"/>
-              <w:pBdr>
-                <w:bottom w:val="none" w:sz="0" w:space="0" w:color="000000"/>
-                <w:top w:val="none" w:sz="0" w:space="0" w:color="000000"/>
-                <w:left w:val="none" w:sz="0" w:space="0" w:color="000000"/>
-                <w:right w:val="none" w:sz="0" w:space="0" w:color="000000"/>
-              </w:pBdr>
-              <w:spacing w:after="100" w:before="100" w:line="240"/>
-              <w:ind w:left="100" w:right="100" w:firstLine="0" w:firstLineChars="0"/>
-              <w:rPr>
-                <w:rFonts w:ascii="Arial" w:hAnsi="Arial" w:eastAsia="Arial" w:cs="Arial"/>
-                <w:i w:val="false"/>
-                <w:b w:val="false"/>
-                <w:u w:val="none"/>
-                <w:strike w:val="false"/>
-                <w:sz w:val="22"/>
-                <w:szCs w:val="22"/>
-                <w:color w:val="000000"/>
-              </w:rPr>
-            </w:pPr>
-            <w:r>
-              <w:rPr>
-                <w:rFonts w:ascii="Arial" w:hAnsi="Arial" w:eastAsia="Arial" w:cs="Arial"/>
-                <w:i w:val="false"/>
-                <w:b w:val="false"/>
-                <w:u w:val="none"/>
-                <w:strike w:val="false"/>
-                <w:sz w:val="22"/>
-                <w:szCs w:val="22"/>
-                <w:color w:val="000000"/>
-              </w:rPr>
-              <w:t xml:space="preserve">140 (53%)</w:t>
+              <w:t xml:space="preserve">1,028 (54%)</w:t>
+            </w:r>
+          </w:p>
+        </w:tc>
+        <w:tc>
+          <w:tcPr>
+            <w:tcBorders>
+              <w:bottom w:val="none" w:sz="0" w:space="0" w:color="000000"/>
+              <w:top w:val="none" w:sz="0" w:space="0" w:color="000000"/>
+              <w:left w:val="none" w:sz="0" w:space="0" w:color="000000"/>
+              <w:right w:val="none" w:sz="0" w:space="0" w:color="000000"/>
+            </w:tcBorders>
+            <w:shd w:val="clear" w:color="auto" w:fill="FFFFFF"/>
+            <w:tcMar>
+              <w:top w:w="0" w:type="dxa"/>
+              <w:bottom w:w="0" w:type="dxa"/>
+              <w:left w:w="0" w:type="dxa"/>
+              <w:right w:w="0" w:type="dxa"/>
+            </w:tcMar>
+            <w:vAlign w:val="top"/>
+          </w:tcPr>
+          <w:p>
+            <w:pPr>
+              <w:jc w:val="center"/>
+              <w:pBdr>
+                <w:bottom w:val="none" w:sz="0" w:space="0" w:color="000000"/>
+                <w:top w:val="none" w:sz="0" w:space="0" w:color="000000"/>
+                <w:left w:val="none" w:sz="0" w:space="0" w:color="000000"/>
+                <w:right w:val="none" w:sz="0" w:space="0" w:color="000000"/>
+              </w:pBdr>
+              <w:spacing w:after="100" w:before="100" w:line="240"/>
+              <w:ind w:left="100" w:right="100" w:firstLine="0" w:firstLineChars="0"/>
+              <w:rPr>
+                <w:rFonts w:ascii="Arial" w:hAnsi="Arial" w:eastAsia="Arial" w:cs="Arial"/>
+                <w:i w:val="false"/>
+                <w:b w:val="false"/>
+                <w:u w:val="none"/>
+                <w:strike w:val="false"/>
+                <w:sz w:val="22"/>
+                <w:szCs w:val="22"/>
+                <w:color w:val="000000"/>
+              </w:rPr>
+            </w:pPr>
+            <w:r>
+              <w:rPr>
+                <w:rFonts w:ascii="Arial" w:hAnsi="Arial" w:eastAsia="Arial" w:cs="Arial"/>
+                <w:i w:val="false"/>
+                <w:b w:val="false"/>
+                <w:u w:val="none"/>
+                <w:strike w:val="false"/>
+                <w:sz w:val="22"/>
+                <w:szCs w:val="22"/>
+                <w:color w:val="000000"/>
+              </w:rPr>
+              <w:t xml:space="preserve">134 (52%)</w:t>
             </w:r>
           </w:p>
         </w:tc>
@@ -1704,115 +1704,115 @@
                 <w:szCs w:val="22"/>
                 <w:color w:val="000000"/>
               </w:rPr>
-              <w:t xml:space="preserve">997 (46%)</w:t>
-            </w:r>
-          </w:p>
-        </w:tc>
-        <w:tc>
-          <w:tcPr>
-            <w:tcBorders>
-              <w:bottom w:val="none" w:sz="0" w:space="0" w:color="000000"/>
-              <w:top w:val="none" w:sz="0" w:space="0" w:color="000000"/>
-              <w:left w:val="none" w:sz="0" w:space="0" w:color="000000"/>
-              <w:right w:val="none" w:sz="0" w:space="0" w:color="000000"/>
-            </w:tcBorders>
-            <w:shd w:val="clear" w:color="auto" w:fill="FFFFFF"/>
-            <w:tcMar>
-              <w:top w:w="0" w:type="dxa"/>
-              <w:bottom w:w="0" w:type="dxa"/>
-              <w:left w:w="0" w:type="dxa"/>
-              <w:right w:w="0" w:type="dxa"/>
-            </w:tcMar>
-            <w:vAlign w:val="top"/>
-          </w:tcPr>
-          <w:p>
-            <w:pPr>
-              <w:jc w:val="center"/>
-              <w:pBdr>
-                <w:bottom w:val="none" w:sz="0" w:space="0" w:color="000000"/>
-                <w:top w:val="none" w:sz="0" w:space="0" w:color="000000"/>
-                <w:left w:val="none" w:sz="0" w:space="0" w:color="000000"/>
-                <w:right w:val="none" w:sz="0" w:space="0" w:color="000000"/>
-              </w:pBdr>
-              <w:spacing w:after="100" w:before="100" w:line="240"/>
-              <w:ind w:left="100" w:right="100" w:firstLine="0" w:firstLineChars="0"/>
-              <w:rPr>
-                <w:rFonts w:ascii="Arial" w:hAnsi="Arial" w:eastAsia="Arial" w:cs="Arial"/>
-                <w:i w:val="false"/>
-                <w:b w:val="false"/>
-                <w:u w:val="none"/>
-                <w:strike w:val="false"/>
-                <w:sz w:val="22"/>
-                <w:szCs w:val="22"/>
-                <w:color w:val="000000"/>
-              </w:rPr>
-            </w:pPr>
-            <w:r>
-              <w:rPr>
-                <w:rFonts w:ascii="Arial" w:hAnsi="Arial" w:eastAsia="Arial" w:cs="Arial"/>
-                <w:i w:val="false"/>
-                <w:b w:val="false"/>
-                <w:u w:val="none"/>
-                <w:strike w:val="false"/>
-                <w:sz w:val="22"/>
-                <w:szCs w:val="22"/>
-                <w:color w:val="000000"/>
-              </w:rPr>
-              <w:t xml:space="preserve">875 (46%)</w:t>
-            </w:r>
-          </w:p>
-        </w:tc>
-        <w:tc>
-          <w:tcPr>
-            <w:tcBorders>
-              <w:bottom w:val="none" w:sz="0" w:space="0" w:color="000000"/>
-              <w:top w:val="none" w:sz="0" w:space="0" w:color="000000"/>
-              <w:left w:val="none" w:sz="0" w:space="0" w:color="000000"/>
-              <w:right w:val="none" w:sz="0" w:space="0" w:color="000000"/>
-            </w:tcBorders>
-            <w:shd w:val="clear" w:color="auto" w:fill="FFFFFF"/>
-            <w:tcMar>
-              <w:top w:w="0" w:type="dxa"/>
-              <w:bottom w:w="0" w:type="dxa"/>
-              <w:left w:w="0" w:type="dxa"/>
-              <w:right w:w="0" w:type="dxa"/>
-            </w:tcMar>
-            <w:vAlign w:val="top"/>
-          </w:tcPr>
-          <w:p>
-            <w:pPr>
-              <w:jc w:val="center"/>
-              <w:pBdr>
-                <w:bottom w:val="none" w:sz="0" w:space="0" w:color="000000"/>
-                <w:top w:val="none" w:sz="0" w:space="0" w:color="000000"/>
-                <w:left w:val="none" w:sz="0" w:space="0" w:color="000000"/>
-                <w:right w:val="none" w:sz="0" w:space="0" w:color="000000"/>
-              </w:pBdr>
-              <w:spacing w:after="100" w:before="100" w:line="240"/>
-              <w:ind w:left="100" w:right="100" w:firstLine="0" w:firstLineChars="0"/>
-              <w:rPr>
-                <w:rFonts w:ascii="Arial" w:hAnsi="Arial" w:eastAsia="Arial" w:cs="Arial"/>
-                <w:i w:val="false"/>
-                <w:b w:val="false"/>
-                <w:u w:val="none"/>
-                <w:strike w:val="false"/>
-                <w:sz w:val="22"/>
-                <w:szCs w:val="22"/>
-                <w:color w:val="000000"/>
-              </w:rPr>
-            </w:pPr>
-            <w:r>
-              <w:rPr>
-                <w:rFonts w:ascii="Arial" w:hAnsi="Arial" w:eastAsia="Arial" w:cs="Arial"/>
-                <w:i w:val="false"/>
-                <w:b w:val="false"/>
-                <w:u w:val="none"/>
-                <w:strike w:val="false"/>
-                <w:sz w:val="22"/>
-                <w:szCs w:val="22"/>
-                <w:color w:val="000000"/>
-              </w:rPr>
-              <w:t xml:space="preserve">122 (47%)</w:t>
+              <w:t xml:space="preserve">998 (46%)</w:t>
+            </w:r>
+          </w:p>
+        </w:tc>
+        <w:tc>
+          <w:tcPr>
+            <w:tcBorders>
+              <w:bottom w:val="none" w:sz="0" w:space="0" w:color="000000"/>
+              <w:top w:val="none" w:sz="0" w:space="0" w:color="000000"/>
+              <w:left w:val="none" w:sz="0" w:space="0" w:color="000000"/>
+              <w:right w:val="none" w:sz="0" w:space="0" w:color="000000"/>
+            </w:tcBorders>
+            <w:shd w:val="clear" w:color="auto" w:fill="FFFFFF"/>
+            <w:tcMar>
+              <w:top w:w="0" w:type="dxa"/>
+              <w:bottom w:w="0" w:type="dxa"/>
+              <w:left w:w="0" w:type="dxa"/>
+              <w:right w:w="0" w:type="dxa"/>
+            </w:tcMar>
+            <w:vAlign w:val="top"/>
+          </w:tcPr>
+          <w:p>
+            <w:pPr>
+              <w:jc w:val="center"/>
+              <w:pBdr>
+                <w:bottom w:val="none" w:sz="0" w:space="0" w:color="000000"/>
+                <w:top w:val="none" w:sz="0" w:space="0" w:color="000000"/>
+                <w:left w:val="none" w:sz="0" w:space="0" w:color="000000"/>
+                <w:right w:val="none" w:sz="0" w:space="0" w:color="000000"/>
+              </w:pBdr>
+              <w:spacing w:after="100" w:before="100" w:line="240"/>
+              <w:ind w:left="100" w:right="100" w:firstLine="0" w:firstLineChars="0"/>
+              <w:rPr>
+                <w:rFonts w:ascii="Arial" w:hAnsi="Arial" w:eastAsia="Arial" w:cs="Arial"/>
+                <w:i w:val="false"/>
+                <w:b w:val="false"/>
+                <w:u w:val="none"/>
+                <w:strike w:val="false"/>
+                <w:sz w:val="22"/>
+                <w:szCs w:val="22"/>
+                <w:color w:val="000000"/>
+              </w:rPr>
+            </w:pPr>
+            <w:r>
+              <w:rPr>
+                <w:rFonts w:ascii="Arial" w:hAnsi="Arial" w:eastAsia="Arial" w:cs="Arial"/>
+                <w:i w:val="false"/>
+                <w:b w:val="false"/>
+                <w:u w:val="none"/>
+                <w:strike w:val="false"/>
+                <w:sz w:val="22"/>
+                <w:szCs w:val="22"/>
+                <w:color w:val="000000"/>
+              </w:rPr>
+              <w:t xml:space="preserve">876 (46%)</w:t>
+            </w:r>
+          </w:p>
+        </w:tc>
+        <w:tc>
+          <w:tcPr>
+            <w:tcBorders>
+              <w:bottom w:val="none" w:sz="0" w:space="0" w:color="000000"/>
+              <w:top w:val="none" w:sz="0" w:space="0" w:color="000000"/>
+              <w:left w:val="none" w:sz="0" w:space="0" w:color="000000"/>
+              <w:right w:val="none" w:sz="0" w:space="0" w:color="000000"/>
+            </w:tcBorders>
+            <w:shd w:val="clear" w:color="auto" w:fill="FFFFFF"/>
+            <w:tcMar>
+              <w:top w:w="0" w:type="dxa"/>
+              <w:bottom w:w="0" w:type="dxa"/>
+              <w:left w:w="0" w:type="dxa"/>
+              <w:right w:w="0" w:type="dxa"/>
+            </w:tcMar>
+            <w:vAlign w:val="top"/>
+          </w:tcPr>
+          <w:p>
+            <w:pPr>
+              <w:jc w:val="center"/>
+              <w:pBdr>
+                <w:bottom w:val="none" w:sz="0" w:space="0" w:color="000000"/>
+                <w:top w:val="none" w:sz="0" w:space="0" w:color="000000"/>
+                <w:left w:val="none" w:sz="0" w:space="0" w:color="000000"/>
+                <w:right w:val="none" w:sz="0" w:space="0" w:color="000000"/>
+              </w:pBdr>
+              <w:spacing w:after="100" w:before="100" w:line="240"/>
+              <w:ind w:left="100" w:right="100" w:firstLine="0" w:firstLineChars="0"/>
+              <w:rPr>
+                <w:rFonts w:ascii="Arial" w:hAnsi="Arial" w:eastAsia="Arial" w:cs="Arial"/>
+                <w:i w:val="false"/>
+                <w:b w:val="false"/>
+                <w:u w:val="none"/>
+                <w:strike w:val="false"/>
+                <w:sz w:val="22"/>
+                <w:szCs w:val="22"/>
+                <w:color w:val="000000"/>
+              </w:rPr>
+            </w:pPr>
+            <w:r>
+              <w:rPr>
+                <w:rFonts w:ascii="Arial" w:hAnsi="Arial" w:eastAsia="Arial" w:cs="Arial"/>
+                <w:i w:val="false"/>
+                <w:b w:val="false"/>
+                <w:u w:val="none"/>
+                <w:strike w:val="false"/>
+                <w:sz w:val="22"/>
+                <w:szCs w:val="22"/>
+                <w:color w:val="000000"/>
+              </w:rPr>
+              <w:t xml:space="preserve">122 (48%)</w:t>
             </w:r>
           </w:p>
         </w:tc>
@@ -1873,7 +1873,7 @@
       </w:tr>
       <w:tr>
         <w:trPr>
-          <w:trHeight w:val="572" w:hRule="auto"/>
+          <w:trHeight w:val="571" w:hRule="auto"/>
         </w:trPr>
         body 6
         <w:tc>
@@ -1980,61 +1980,61 @@
                 <w:szCs w:val="22"/>
                 <w:color w:val="000000"/>
               </w:rPr>
-              <w:t xml:space="preserve">63</w:t>
-            </w:r>
-          </w:p>
-        </w:tc>
-        <w:tc>
-          <w:tcPr>
-            <w:tcBorders>
-              <w:bottom w:val="none" w:sz="0" w:space="0" w:color="000000"/>
-              <w:top w:val="none" w:sz="0" w:space="0" w:color="000000"/>
-              <w:left w:val="none" w:sz="0" w:space="0" w:color="000000"/>
-              <w:right w:val="none" w:sz="0" w:space="0" w:color="000000"/>
-            </w:tcBorders>
-            <w:shd w:val="clear" w:color="auto" w:fill="FFFFFF"/>
-            <w:tcMar>
-              <w:top w:w="0" w:type="dxa"/>
-              <w:bottom w:w="0" w:type="dxa"/>
-              <w:left w:w="0" w:type="dxa"/>
-              <w:right w:w="0" w:type="dxa"/>
-            </w:tcMar>
-            <w:vAlign w:val="top"/>
-          </w:tcPr>
-          <w:p>
-            <w:pPr>
-              <w:jc w:val="center"/>
-              <w:pBdr>
-                <w:bottom w:val="none" w:sz="0" w:space="0" w:color="000000"/>
-                <w:top w:val="none" w:sz="0" w:space="0" w:color="000000"/>
-                <w:left w:val="none" w:sz="0" w:space="0" w:color="000000"/>
-                <w:right w:val="none" w:sz="0" w:space="0" w:color="000000"/>
-              </w:pBdr>
-              <w:spacing w:after="100" w:before="100" w:line="240"/>
-              <w:ind w:left="100" w:right="100" w:firstLine="0" w:firstLineChars="0"/>
-              <w:rPr>
-                <w:rFonts w:ascii="Arial" w:hAnsi="Arial" w:eastAsia="Arial" w:cs="Arial"/>
-                <w:i w:val="false"/>
-                <w:b w:val="false"/>
-                <w:u w:val="none"/>
-                <w:strike w:val="false"/>
-                <w:sz w:val="22"/>
-                <w:szCs w:val="22"/>
-                <w:color w:val="000000"/>
-              </w:rPr>
-            </w:pPr>
-            <w:r>
-              <w:rPr>
-                <w:rFonts w:ascii="Arial" w:hAnsi="Arial" w:eastAsia="Arial" w:cs="Arial"/>
-                <w:i w:val="false"/>
-                <w:b w:val="false"/>
-                <w:u w:val="none"/>
-                <w:strike w:val="false"/>
-                <w:sz w:val="22"/>
-                <w:szCs w:val="22"/>
-                <w:color w:val="000000"/>
-              </w:rPr>
-              <w:t xml:space="preserve">59</w:t>
+              <w:t xml:space="preserve">62</w:t>
+            </w:r>
+          </w:p>
+        </w:tc>
+        <w:tc>
+          <w:tcPr>
+            <w:tcBorders>
+              <w:bottom w:val="none" w:sz="0" w:space="0" w:color="000000"/>
+              <w:top w:val="none" w:sz="0" w:space="0" w:color="000000"/>
+              <w:left w:val="none" w:sz="0" w:space="0" w:color="000000"/>
+              <w:right w:val="none" w:sz="0" w:space="0" w:color="000000"/>
+            </w:tcBorders>
+            <w:shd w:val="clear" w:color="auto" w:fill="FFFFFF"/>
+            <w:tcMar>
+              <w:top w:w="0" w:type="dxa"/>
+              <w:bottom w:w="0" w:type="dxa"/>
+              <w:left w:w="0" w:type="dxa"/>
+              <w:right w:w="0" w:type="dxa"/>
+            </w:tcMar>
+            <w:vAlign w:val="top"/>
+          </w:tcPr>
+          <w:p>
+            <w:pPr>
+              <w:jc w:val="center"/>
+              <w:pBdr>
+                <w:bottom w:val="none" w:sz="0" w:space="0" w:color="000000"/>
+                <w:top w:val="none" w:sz="0" w:space="0" w:color="000000"/>
+                <w:left w:val="none" w:sz="0" w:space="0" w:color="000000"/>
+                <w:right w:val="none" w:sz="0" w:space="0" w:color="000000"/>
+              </w:pBdr>
+              <w:spacing w:after="100" w:before="100" w:line="240"/>
+              <w:ind w:left="100" w:right="100" w:firstLine="0" w:firstLineChars="0"/>
+              <w:rPr>
+                <w:rFonts w:ascii="Arial" w:hAnsi="Arial" w:eastAsia="Arial" w:cs="Arial"/>
+                <w:i w:val="false"/>
+                <w:b w:val="false"/>
+                <w:u w:val="none"/>
+                <w:strike w:val="false"/>
+                <w:sz w:val="22"/>
+                <w:szCs w:val="22"/>
+                <w:color w:val="000000"/>
+              </w:rPr>
+            </w:pPr>
+            <w:r>
+              <w:rPr>
+                <w:rFonts w:ascii="Arial" w:hAnsi="Arial" w:eastAsia="Arial" w:cs="Arial"/>
+                <w:i w:val="false"/>
+                <w:b w:val="false"/>
+                <w:u w:val="none"/>
+                <w:strike w:val="false"/>
+                <w:sz w:val="22"/>
+                <w:szCs w:val="22"/>
+                <w:color w:val="000000"/>
+              </w:rPr>
+              <w:t xml:space="preserve">58</w:t>
             </w:r>
           </w:p>
         </w:tc>
@@ -2418,7 +2418,7 @@
                 <w:szCs w:val="22"/>
                 <w:color w:val="000000"/>
               </w:rPr>
-              <w:t xml:space="preserve">0.087</w:t>
+              <w:t xml:space="preserve">0.11</w:t>
             </w:r>
           </w:p>
         </w:tc>
@@ -2586,61 +2586,61 @@
                 <w:szCs w:val="22"/>
                 <w:color w:val="000000"/>
               </w:rPr>
-              <w:t xml:space="preserve">653 (34%)</w:t>
-            </w:r>
-          </w:p>
-        </w:tc>
-        <w:tc>
-          <w:tcPr>
-            <w:tcBorders>
-              <w:bottom w:val="none" w:sz="0" w:space="0" w:color="000000"/>
-              <w:top w:val="none" w:sz="0" w:space="0" w:color="000000"/>
-              <w:left w:val="none" w:sz="0" w:space="0" w:color="000000"/>
-              <w:right w:val="none" w:sz="0" w:space="0" w:color="000000"/>
-            </w:tcBorders>
-            <w:shd w:val="clear" w:color="auto" w:fill="FFFFFF"/>
-            <w:tcMar>
-              <w:top w:w="0" w:type="dxa"/>
-              <w:bottom w:w="0" w:type="dxa"/>
-              <w:left w:w="0" w:type="dxa"/>
-              <w:right w:w="0" w:type="dxa"/>
-            </w:tcMar>
-            <w:vAlign w:val="top"/>
-          </w:tcPr>
-          <w:p>
-            <w:pPr>
-              <w:jc w:val="center"/>
-              <w:pBdr>
-                <w:bottom w:val="none" w:sz="0" w:space="0" w:color="000000"/>
-                <w:top w:val="none" w:sz="0" w:space="0" w:color="000000"/>
-                <w:left w:val="none" w:sz="0" w:space="0" w:color="000000"/>
-                <w:right w:val="none" w:sz="0" w:space="0" w:color="000000"/>
-              </w:pBdr>
-              <w:spacing w:after="100" w:before="100" w:line="240"/>
-              <w:ind w:left="100" w:right="100" w:firstLine="0" w:firstLineChars="0"/>
-              <w:rPr>
-                <w:rFonts w:ascii="Arial" w:hAnsi="Arial" w:eastAsia="Arial" w:cs="Arial"/>
-                <w:i w:val="false"/>
-                <w:b w:val="false"/>
-                <w:u w:val="none"/>
-                <w:strike w:val="false"/>
-                <w:sz w:val="22"/>
-                <w:szCs w:val="22"/>
-                <w:color w:val="000000"/>
-              </w:rPr>
-            </w:pPr>
-            <w:r>
-              <w:rPr>
-                <w:rFonts w:ascii="Arial" w:hAnsi="Arial" w:eastAsia="Arial" w:cs="Arial"/>
-                <w:i w:val="false"/>
-                <w:b w:val="false"/>
-                <w:u w:val="none"/>
-                <w:strike w:val="false"/>
-                <w:sz w:val="22"/>
-                <w:szCs w:val="22"/>
-                <w:color w:val="000000"/>
-              </w:rPr>
-              <w:t xml:space="preserve">85 (33%)</w:t>
+              <w:t xml:space="preserve">655 (34%)</w:t>
+            </w:r>
+          </w:p>
+        </w:tc>
+        <w:tc>
+          <w:tcPr>
+            <w:tcBorders>
+              <w:bottom w:val="none" w:sz="0" w:space="0" w:color="000000"/>
+              <w:top w:val="none" w:sz="0" w:space="0" w:color="000000"/>
+              <w:left w:val="none" w:sz="0" w:space="0" w:color="000000"/>
+              <w:right w:val="none" w:sz="0" w:space="0" w:color="000000"/>
+            </w:tcBorders>
+            <w:shd w:val="clear" w:color="auto" w:fill="FFFFFF"/>
+            <w:tcMar>
+              <w:top w:w="0" w:type="dxa"/>
+              <w:bottom w:w="0" w:type="dxa"/>
+              <w:left w:w="0" w:type="dxa"/>
+              <w:right w:w="0" w:type="dxa"/>
+            </w:tcMar>
+            <w:vAlign w:val="top"/>
+          </w:tcPr>
+          <w:p>
+            <w:pPr>
+              <w:jc w:val="center"/>
+              <w:pBdr>
+                <w:bottom w:val="none" w:sz="0" w:space="0" w:color="000000"/>
+                <w:top w:val="none" w:sz="0" w:space="0" w:color="000000"/>
+                <w:left w:val="none" w:sz="0" w:space="0" w:color="000000"/>
+                <w:right w:val="none" w:sz="0" w:space="0" w:color="000000"/>
+              </w:pBdr>
+              <w:spacing w:after="100" w:before="100" w:line="240"/>
+              <w:ind w:left="100" w:right="100" w:firstLine="0" w:firstLineChars="0"/>
+              <w:rPr>
+                <w:rFonts w:ascii="Arial" w:hAnsi="Arial" w:eastAsia="Arial" w:cs="Arial"/>
+                <w:i w:val="false"/>
+                <w:b w:val="false"/>
+                <w:u w:val="none"/>
+                <w:strike w:val="false"/>
+                <w:sz w:val="22"/>
+                <w:szCs w:val="22"/>
+                <w:color w:val="000000"/>
+              </w:rPr>
+            </w:pPr>
+            <w:r>
+              <w:rPr>
+                <w:rFonts w:ascii="Arial" w:hAnsi="Arial" w:eastAsia="Arial" w:cs="Arial"/>
+                <w:i w:val="false"/>
+                <w:b w:val="false"/>
+                <w:u w:val="none"/>
+                <w:strike w:val="false"/>
+                <w:sz w:val="22"/>
+                <w:szCs w:val="22"/>
+                <w:color w:val="000000"/>
+              </w:rPr>
+              <w:t xml:space="preserve">83 (33%)</w:t>
             </w:r>
           </w:p>
         </w:tc>
@@ -2862,61 +2862,61 @@
                 <w:szCs w:val="22"/>
                 <w:color w:val="000000"/>
               </w:rPr>
-              <w:t xml:space="preserve">410 (21%)</w:t>
-            </w:r>
-          </w:p>
-        </w:tc>
-        <w:tc>
-          <w:tcPr>
-            <w:tcBorders>
-              <w:bottom w:val="none" w:sz="0" w:space="0" w:color="000000"/>
-              <w:top w:val="none" w:sz="0" w:space="0" w:color="000000"/>
-              <w:left w:val="none" w:sz="0" w:space="0" w:color="000000"/>
-              <w:right w:val="none" w:sz="0" w:space="0" w:color="000000"/>
-            </w:tcBorders>
-            <w:shd w:val="clear" w:color="auto" w:fill="FFFFFF"/>
-            <w:tcMar>
-              <w:top w:w="0" w:type="dxa"/>
-              <w:bottom w:w="0" w:type="dxa"/>
-              <w:left w:w="0" w:type="dxa"/>
-              <w:right w:w="0" w:type="dxa"/>
-            </w:tcMar>
-            <w:vAlign w:val="top"/>
-          </w:tcPr>
-          <w:p>
-            <w:pPr>
-              <w:jc w:val="center"/>
-              <w:pBdr>
-                <w:bottom w:val="none" w:sz="0" w:space="0" w:color="000000"/>
-                <w:top w:val="none" w:sz="0" w:space="0" w:color="000000"/>
-                <w:left w:val="none" w:sz="0" w:space="0" w:color="000000"/>
-                <w:right w:val="none" w:sz="0" w:space="0" w:color="000000"/>
-              </w:pBdr>
-              <w:spacing w:after="100" w:before="100" w:line="240"/>
-              <w:ind w:left="100" w:right="100" w:firstLine="0" w:firstLineChars="0"/>
-              <w:rPr>
-                <w:rFonts w:ascii="Arial" w:hAnsi="Arial" w:eastAsia="Arial" w:cs="Arial"/>
-                <w:i w:val="false"/>
-                <w:b w:val="false"/>
-                <w:u w:val="none"/>
-                <w:strike w:val="false"/>
-                <w:sz w:val="22"/>
-                <w:szCs w:val="22"/>
-                <w:color w:val="000000"/>
-              </w:rPr>
-            </w:pPr>
-            <w:r>
-              <w:rPr>
-                <w:rFonts w:ascii="Arial" w:hAnsi="Arial" w:eastAsia="Arial" w:cs="Arial"/>
-                <w:i w:val="false"/>
-                <w:b w:val="false"/>
-                <w:u w:val="none"/>
-                <w:strike w:val="false"/>
-                <w:sz w:val="22"/>
-                <w:szCs w:val="22"/>
-                <w:color w:val="000000"/>
-              </w:rPr>
-              <w:t xml:space="preserve">67 (26%)</w:t>
+              <w:t xml:space="preserve">413 (21%)</w:t>
+            </w:r>
+          </w:p>
+        </w:tc>
+        <w:tc>
+          <w:tcPr>
+            <w:tcBorders>
+              <w:bottom w:val="none" w:sz="0" w:space="0" w:color="000000"/>
+              <w:top w:val="none" w:sz="0" w:space="0" w:color="000000"/>
+              <w:left w:val="none" w:sz="0" w:space="0" w:color="000000"/>
+              <w:right w:val="none" w:sz="0" w:space="0" w:color="000000"/>
+            </w:tcBorders>
+            <w:shd w:val="clear" w:color="auto" w:fill="FFFFFF"/>
+            <w:tcMar>
+              <w:top w:w="0" w:type="dxa"/>
+              <w:bottom w:w="0" w:type="dxa"/>
+              <w:left w:w="0" w:type="dxa"/>
+              <w:right w:w="0" w:type="dxa"/>
+            </w:tcMar>
+            <w:vAlign w:val="top"/>
+          </w:tcPr>
+          <w:p>
+            <w:pPr>
+              <w:jc w:val="center"/>
+              <w:pBdr>
+                <w:bottom w:val="none" w:sz="0" w:space="0" w:color="000000"/>
+                <w:top w:val="none" w:sz="0" w:space="0" w:color="000000"/>
+                <w:left w:val="none" w:sz="0" w:space="0" w:color="000000"/>
+                <w:right w:val="none" w:sz="0" w:space="0" w:color="000000"/>
+              </w:pBdr>
+              <w:spacing w:after="100" w:before="100" w:line="240"/>
+              <w:ind w:left="100" w:right="100" w:firstLine="0" w:firstLineChars="0"/>
+              <w:rPr>
+                <w:rFonts w:ascii="Arial" w:hAnsi="Arial" w:eastAsia="Arial" w:cs="Arial"/>
+                <w:i w:val="false"/>
+                <w:b w:val="false"/>
+                <w:u w:val="none"/>
+                <w:strike w:val="false"/>
+                <w:sz w:val="22"/>
+                <w:szCs w:val="22"/>
+                <w:color w:val="000000"/>
+              </w:rPr>
+            </w:pPr>
+            <w:r>
+              <w:rPr>
+                <w:rFonts w:ascii="Arial" w:hAnsi="Arial" w:eastAsia="Arial" w:cs="Arial"/>
+                <w:i w:val="false"/>
+                <w:b w:val="false"/>
+                <w:u w:val="none"/>
+                <w:strike w:val="false"/>
+                <w:sz w:val="22"/>
+                <w:szCs w:val="22"/>
+                <w:color w:val="000000"/>
+              </w:rPr>
+              <w:t xml:space="preserve">64 (25%)</w:t>
             </w:r>
           </w:p>
         </w:tc>
@@ -3138,61 +3138,61 @@
                 <w:szCs w:val="22"/>
                 <w:color w:val="000000"/>
               </w:rPr>
-              <w:t xml:space="preserve">716 (37%)</w:t>
-            </w:r>
-          </w:p>
-        </w:tc>
-        <w:tc>
-          <w:tcPr>
-            <w:tcBorders>
-              <w:bottom w:val="none" w:sz="0" w:space="0" w:color="000000"/>
-              <w:top w:val="none" w:sz="0" w:space="0" w:color="000000"/>
-              <w:left w:val="none" w:sz="0" w:space="0" w:color="000000"/>
-              <w:right w:val="none" w:sz="0" w:space="0" w:color="000000"/>
-            </w:tcBorders>
-            <w:shd w:val="clear" w:color="auto" w:fill="FFFFFF"/>
-            <w:tcMar>
-              <w:top w:w="0" w:type="dxa"/>
-              <w:bottom w:w="0" w:type="dxa"/>
-              <w:left w:w="0" w:type="dxa"/>
-              <w:right w:w="0" w:type="dxa"/>
-            </w:tcMar>
-            <w:vAlign w:val="top"/>
-          </w:tcPr>
-          <w:p>
-            <w:pPr>
-              <w:jc w:val="center"/>
-              <w:pBdr>
-                <w:bottom w:val="none" w:sz="0" w:space="0" w:color="000000"/>
-                <w:top w:val="none" w:sz="0" w:space="0" w:color="000000"/>
-                <w:left w:val="none" w:sz="0" w:space="0" w:color="000000"/>
-                <w:right w:val="none" w:sz="0" w:space="0" w:color="000000"/>
-              </w:pBdr>
-              <w:spacing w:after="100" w:before="100" w:line="240"/>
-              <w:ind w:left="100" w:right="100" w:firstLine="0" w:firstLineChars="0"/>
-              <w:rPr>
-                <w:rFonts w:ascii="Arial" w:hAnsi="Arial" w:eastAsia="Arial" w:cs="Arial"/>
-                <w:i w:val="false"/>
-                <w:b w:val="false"/>
-                <w:u w:val="none"/>
-                <w:strike w:val="false"/>
-                <w:sz w:val="22"/>
-                <w:szCs w:val="22"/>
-                <w:color w:val="000000"/>
-              </w:rPr>
-            </w:pPr>
-            <w:r>
-              <w:rPr>
-                <w:rFonts w:ascii="Arial" w:hAnsi="Arial" w:eastAsia="Arial" w:cs="Arial"/>
-                <w:i w:val="false"/>
-                <w:b w:val="false"/>
-                <w:u w:val="none"/>
-                <w:strike w:val="false"/>
-                <w:sz w:val="22"/>
-                <w:szCs w:val="22"/>
-                <w:color w:val="000000"/>
-              </w:rPr>
-              <w:t xml:space="preserve">78 (30%)</w:t>
+              <w:t xml:space="preserve">717 (37%)</w:t>
+            </w:r>
+          </w:p>
+        </w:tc>
+        <w:tc>
+          <w:tcPr>
+            <w:tcBorders>
+              <w:bottom w:val="none" w:sz="0" w:space="0" w:color="000000"/>
+              <w:top w:val="none" w:sz="0" w:space="0" w:color="000000"/>
+              <w:left w:val="none" w:sz="0" w:space="0" w:color="000000"/>
+              <w:right w:val="none" w:sz="0" w:space="0" w:color="000000"/>
+            </w:tcBorders>
+            <w:shd w:val="clear" w:color="auto" w:fill="FFFFFF"/>
+            <w:tcMar>
+              <w:top w:w="0" w:type="dxa"/>
+              <w:bottom w:w="0" w:type="dxa"/>
+              <w:left w:w="0" w:type="dxa"/>
+              <w:right w:w="0" w:type="dxa"/>
+            </w:tcMar>
+            <w:vAlign w:val="top"/>
+          </w:tcPr>
+          <w:p>
+            <w:pPr>
+              <w:jc w:val="center"/>
+              <w:pBdr>
+                <w:bottom w:val="none" w:sz="0" w:space="0" w:color="000000"/>
+                <w:top w:val="none" w:sz="0" w:space="0" w:color="000000"/>
+                <w:left w:val="none" w:sz="0" w:space="0" w:color="000000"/>
+                <w:right w:val="none" w:sz="0" w:space="0" w:color="000000"/>
+              </w:pBdr>
+              <w:spacing w:after="100" w:before="100" w:line="240"/>
+              <w:ind w:left="100" w:right="100" w:firstLine="0" w:firstLineChars="0"/>
+              <w:rPr>
+                <w:rFonts w:ascii="Arial" w:hAnsi="Arial" w:eastAsia="Arial" w:cs="Arial"/>
+                <w:i w:val="false"/>
+                <w:b w:val="false"/>
+                <w:u w:val="none"/>
+                <w:strike w:val="false"/>
+                <w:sz w:val="22"/>
+                <w:szCs w:val="22"/>
+                <w:color w:val="000000"/>
+              </w:rPr>
+            </w:pPr>
+            <w:r>
+              <w:rPr>
+                <w:rFonts w:ascii="Arial" w:hAnsi="Arial" w:eastAsia="Arial" w:cs="Arial"/>
+                <w:i w:val="false"/>
+                <w:b w:val="false"/>
+                <w:u w:val="none"/>
+                <w:strike w:val="false"/>
+                <w:sz w:val="22"/>
+                <w:szCs w:val="22"/>
+                <w:color w:val="000000"/>
+              </w:rPr>
+              <w:t xml:space="preserve">77 (30%)</w:t>
             </w:r>
           </w:p>
         </w:tc>
@@ -4020,7 +4020,7 @@
                 <w:szCs w:val="22"/>
                 <w:color w:val="000000"/>
               </w:rPr>
-              <w:t xml:space="preserve">10 (3.8%)</w:t>
+              <w:t xml:space="preserve">10 (3.9%)</w:t>
             </w:r>
           </w:p>
         </w:tc>
@@ -4296,7 +4296,7 @@
                 <w:szCs w:val="22"/>
                 <w:color w:val="000000"/>
               </w:rPr>
-              <w:t xml:space="preserve">19 (7.3%)</w:t>
+              <w:t xml:space="preserve">19 (7.5%)</w:t>
             </w:r>
           </w:p>
         </w:tc>
@@ -5070,61 +5070,61 @@
                 <w:szCs w:val="22"/>
                 <w:color w:val="000000"/>
               </w:rPr>
-              <w:t xml:space="preserve">1,264 (66%)</w:t>
-            </w:r>
-          </w:p>
-        </w:tc>
-        <w:tc>
-          <w:tcPr>
-            <w:tcBorders>
-              <w:bottom w:val="none" w:sz="0" w:space="0" w:color="000000"/>
-              <w:top w:val="none" w:sz="0" w:space="0" w:color="000000"/>
-              <w:left w:val="none" w:sz="0" w:space="0" w:color="000000"/>
-              <w:right w:val="none" w:sz="0" w:space="0" w:color="000000"/>
-            </w:tcBorders>
-            <w:shd w:val="clear" w:color="auto" w:fill="FFFFFF"/>
-            <w:tcMar>
-              <w:top w:w="0" w:type="dxa"/>
-              <w:bottom w:w="0" w:type="dxa"/>
-              <w:left w:w="0" w:type="dxa"/>
-              <w:right w:w="0" w:type="dxa"/>
-            </w:tcMar>
-            <w:vAlign w:val="top"/>
-          </w:tcPr>
-          <w:p>
-            <w:pPr>
-              <w:jc w:val="center"/>
-              <w:pBdr>
-                <w:bottom w:val="none" w:sz="0" w:space="0" w:color="000000"/>
-                <w:top w:val="none" w:sz="0" w:space="0" w:color="000000"/>
-                <w:left w:val="none" w:sz="0" w:space="0" w:color="000000"/>
-                <w:right w:val="none" w:sz="0" w:space="0" w:color="000000"/>
-              </w:pBdr>
-              <w:spacing w:after="100" w:before="100" w:line="240"/>
-              <w:ind w:left="100" w:right="100" w:firstLine="0" w:firstLineChars="0"/>
-              <w:rPr>
-                <w:rFonts w:ascii="Arial" w:hAnsi="Arial" w:eastAsia="Arial" w:cs="Arial"/>
-                <w:i w:val="false"/>
-                <w:b w:val="false"/>
-                <w:u w:val="none"/>
-                <w:strike w:val="false"/>
-                <w:sz w:val="22"/>
-                <w:szCs w:val="22"/>
-                <w:color w:val="000000"/>
-              </w:rPr>
-            </w:pPr>
-            <w:r>
-              <w:rPr>
-                <w:rFonts w:ascii="Arial" w:hAnsi="Arial" w:eastAsia="Arial" w:cs="Arial"/>
-                <w:i w:val="false"/>
-                <w:b w:val="false"/>
-                <w:u w:val="none"/>
-                <w:strike w:val="false"/>
-                <w:sz w:val="22"/>
-                <w:szCs w:val="22"/>
-                <w:color w:val="000000"/>
-              </w:rPr>
-              <w:t xml:space="preserve">173 (67%)</w:t>
+              <w:t xml:space="preserve">1,269 (66%)</w:t>
+            </w:r>
+          </w:p>
+        </w:tc>
+        <w:tc>
+          <w:tcPr>
+            <w:tcBorders>
+              <w:bottom w:val="none" w:sz="0" w:space="0" w:color="000000"/>
+              <w:top w:val="none" w:sz="0" w:space="0" w:color="000000"/>
+              <w:left w:val="none" w:sz="0" w:space="0" w:color="000000"/>
+              <w:right w:val="none" w:sz="0" w:space="0" w:color="000000"/>
+            </w:tcBorders>
+            <w:shd w:val="clear" w:color="auto" w:fill="FFFFFF"/>
+            <w:tcMar>
+              <w:top w:w="0" w:type="dxa"/>
+              <w:bottom w:w="0" w:type="dxa"/>
+              <w:left w:w="0" w:type="dxa"/>
+              <w:right w:w="0" w:type="dxa"/>
+            </w:tcMar>
+            <w:vAlign w:val="top"/>
+          </w:tcPr>
+          <w:p>
+            <w:pPr>
+              <w:jc w:val="center"/>
+              <w:pBdr>
+                <w:bottom w:val="none" w:sz="0" w:space="0" w:color="000000"/>
+                <w:top w:val="none" w:sz="0" w:space="0" w:color="000000"/>
+                <w:left w:val="none" w:sz="0" w:space="0" w:color="000000"/>
+                <w:right w:val="none" w:sz="0" w:space="0" w:color="000000"/>
+              </w:pBdr>
+              <w:spacing w:after="100" w:before="100" w:line="240"/>
+              <w:ind w:left="100" w:right="100" w:firstLine="0" w:firstLineChars="0"/>
+              <w:rPr>
+                <w:rFonts w:ascii="Arial" w:hAnsi="Arial" w:eastAsia="Arial" w:cs="Arial"/>
+                <w:i w:val="false"/>
+                <w:b w:val="false"/>
+                <w:u w:val="none"/>
+                <w:strike w:val="false"/>
+                <w:sz w:val="22"/>
+                <w:szCs w:val="22"/>
+                <w:color w:val="000000"/>
+              </w:rPr>
+            </w:pPr>
+            <w:r>
+              <w:rPr>
+                <w:rFonts w:ascii="Arial" w:hAnsi="Arial" w:eastAsia="Arial" w:cs="Arial"/>
+                <w:i w:val="false"/>
+                <w:b w:val="false"/>
+                <w:u w:val="none"/>
+                <w:strike w:val="false"/>
+                <w:sz w:val="22"/>
+                <w:szCs w:val="22"/>
+                <w:color w:val="000000"/>
+              </w:rPr>
+              <w:t xml:space="preserve">168 (66%)</w:t>
             </w:r>
           </w:p>
         </w:tc>
@@ -5346,61 +5346,61 @@
                 <w:szCs w:val="22"/>
                 <w:color w:val="000000"/>
               </w:rPr>
-              <w:t xml:space="preserve">510 (27%)</w:t>
-            </w:r>
-          </w:p>
-        </w:tc>
-        <w:tc>
-          <w:tcPr>
-            <w:tcBorders>
-              <w:bottom w:val="none" w:sz="0" w:space="0" w:color="000000"/>
-              <w:top w:val="none" w:sz="0" w:space="0" w:color="000000"/>
-              <w:left w:val="none" w:sz="0" w:space="0" w:color="000000"/>
-              <w:right w:val="none" w:sz="0" w:space="0" w:color="000000"/>
-            </w:tcBorders>
-            <w:shd w:val="clear" w:color="auto" w:fill="FFFFFF"/>
-            <w:tcMar>
-              <w:top w:w="0" w:type="dxa"/>
-              <w:bottom w:w="0" w:type="dxa"/>
-              <w:left w:w="0" w:type="dxa"/>
-              <w:right w:w="0" w:type="dxa"/>
-            </w:tcMar>
-            <w:vAlign w:val="top"/>
-          </w:tcPr>
-          <w:p>
-            <w:pPr>
-              <w:jc w:val="center"/>
-              <w:pBdr>
-                <w:bottom w:val="none" w:sz="0" w:space="0" w:color="000000"/>
-                <w:top w:val="none" w:sz="0" w:space="0" w:color="000000"/>
-                <w:left w:val="none" w:sz="0" w:space="0" w:color="000000"/>
-                <w:right w:val="none" w:sz="0" w:space="0" w:color="000000"/>
-              </w:pBdr>
-              <w:spacing w:after="100" w:before="100" w:line="240"/>
-              <w:ind w:left="100" w:right="100" w:firstLine="0" w:firstLineChars="0"/>
-              <w:rPr>
-                <w:rFonts w:ascii="Arial" w:hAnsi="Arial" w:eastAsia="Arial" w:cs="Arial"/>
-                <w:i w:val="false"/>
-                <w:b w:val="false"/>
-                <w:u w:val="none"/>
-                <w:strike w:val="false"/>
-                <w:sz w:val="22"/>
-                <w:szCs w:val="22"/>
-                <w:color w:val="000000"/>
-              </w:rPr>
-            </w:pPr>
-            <w:r>
-              <w:rPr>
-                <w:rFonts w:ascii="Arial" w:hAnsi="Arial" w:eastAsia="Arial" w:cs="Arial"/>
-                <w:i w:val="false"/>
-                <w:b w:val="false"/>
-                <w:u w:val="none"/>
-                <w:strike w:val="false"/>
-                <w:sz w:val="22"/>
-                <w:szCs w:val="22"/>
-                <w:color w:val="000000"/>
-              </w:rPr>
-              <w:t xml:space="preserve">69 (27%)</w:t>
+              <w:t xml:space="preserve">511 (27%)</w:t>
+            </w:r>
+          </w:p>
+        </w:tc>
+        <w:tc>
+          <w:tcPr>
+            <w:tcBorders>
+              <w:bottom w:val="none" w:sz="0" w:space="0" w:color="000000"/>
+              <w:top w:val="none" w:sz="0" w:space="0" w:color="000000"/>
+              <w:left w:val="none" w:sz="0" w:space="0" w:color="000000"/>
+              <w:right w:val="none" w:sz="0" w:space="0" w:color="000000"/>
+            </w:tcBorders>
+            <w:shd w:val="clear" w:color="auto" w:fill="FFFFFF"/>
+            <w:tcMar>
+              <w:top w:w="0" w:type="dxa"/>
+              <w:bottom w:w="0" w:type="dxa"/>
+              <w:left w:w="0" w:type="dxa"/>
+              <w:right w:w="0" w:type="dxa"/>
+            </w:tcMar>
+            <w:vAlign w:val="top"/>
+          </w:tcPr>
+          <w:p>
+            <w:pPr>
+              <w:jc w:val="center"/>
+              <w:pBdr>
+                <w:bottom w:val="none" w:sz="0" w:space="0" w:color="000000"/>
+                <w:top w:val="none" w:sz="0" w:space="0" w:color="000000"/>
+                <w:left w:val="none" w:sz="0" w:space="0" w:color="000000"/>
+                <w:right w:val="none" w:sz="0" w:space="0" w:color="000000"/>
+              </w:pBdr>
+              <w:spacing w:after="100" w:before="100" w:line="240"/>
+              <w:ind w:left="100" w:right="100" w:firstLine="0" w:firstLineChars="0"/>
+              <w:rPr>
+                <w:rFonts w:ascii="Arial" w:hAnsi="Arial" w:eastAsia="Arial" w:cs="Arial"/>
+                <w:i w:val="false"/>
+                <w:b w:val="false"/>
+                <w:u w:val="none"/>
+                <w:strike w:val="false"/>
+                <w:sz w:val="22"/>
+                <w:szCs w:val="22"/>
+                <w:color w:val="000000"/>
+              </w:rPr>
+            </w:pPr>
+            <w:r>
+              <w:rPr>
+                <w:rFonts w:ascii="Arial" w:hAnsi="Arial" w:eastAsia="Arial" w:cs="Arial"/>
+                <w:i w:val="false"/>
+                <w:b w:val="false"/>
+                <w:u w:val="none"/>
+                <w:strike w:val="false"/>
+                <w:sz w:val="22"/>
+                <w:szCs w:val="22"/>
+                <w:color w:val="000000"/>
+              </w:rPr>
+              <w:t xml:space="preserve">68 (27%)</w:t>
             </w:r>
           </w:p>
         </w:tc>
@@ -5676,7 +5676,7 @@
                 <w:szCs w:val="22"/>
                 <w:color w:val="000000"/>
               </w:rPr>
-              <w:t xml:space="preserve">6 (2.3%)</w:t>
+              <w:t xml:space="preserve">6 (2.4%)</w:t>
             </w:r>
           </w:p>
         </w:tc>
@@ -5952,7 +5952,7 @@
                 <w:szCs w:val="22"/>
                 <w:color w:val="000000"/>
               </w:rPr>
-              <w:t xml:space="preserve">11 (4.2%)</w:t>
+              <w:t xml:space="preserve">11 (4.3%)</w:t>
             </w:r>
           </w:p>
         </w:tc>
@@ -6565,7 +6565,7 @@
       </w:tr>
       <w:tr>
         <w:trPr>
-          <w:trHeight w:val="572" w:hRule="auto"/>
+          <w:trHeight w:val="571" w:hRule="auto"/>
         </w:trPr>
         body23
         <w:tc>
@@ -6726,61 +6726,61 @@
                 <w:szCs w:val="22"/>
                 <w:color w:val="000000"/>
               </w:rPr>
-              <w:t xml:space="preserve">137</w:t>
-            </w:r>
-          </w:p>
-        </w:tc>
-        <w:tc>
-          <w:tcPr>
-            <w:tcBorders>
-              <w:bottom w:val="none" w:sz="0" w:space="0" w:color="000000"/>
-              <w:top w:val="none" w:sz="0" w:space="0" w:color="000000"/>
-              <w:left w:val="none" w:sz="0" w:space="0" w:color="000000"/>
-              <w:right w:val="none" w:sz="0" w:space="0" w:color="000000"/>
-            </w:tcBorders>
-            <w:shd w:val="clear" w:color="auto" w:fill="FFFFFF"/>
-            <w:tcMar>
-              <w:top w:w="0" w:type="dxa"/>
-              <w:bottom w:w="0" w:type="dxa"/>
-              <w:left w:w="0" w:type="dxa"/>
-              <w:right w:w="0" w:type="dxa"/>
-            </w:tcMar>
-            <w:vAlign w:val="top"/>
-          </w:tcPr>
-          <w:p>
-            <w:pPr>
-              <w:jc w:val="center"/>
-              <w:pBdr>
-                <w:bottom w:val="none" w:sz="0" w:space="0" w:color="000000"/>
-                <w:top w:val="none" w:sz="0" w:space="0" w:color="000000"/>
-                <w:left w:val="none" w:sz="0" w:space="0" w:color="000000"/>
-                <w:right w:val="none" w:sz="0" w:space="0" w:color="000000"/>
-              </w:pBdr>
-              <w:spacing w:after="100" w:before="100" w:line="240"/>
-              <w:ind w:left="100" w:right="100" w:firstLine="0" w:firstLineChars="0"/>
-              <w:rPr>
-                <w:rFonts w:ascii="Arial" w:hAnsi="Arial" w:eastAsia="Arial" w:cs="Arial"/>
-                <w:i w:val="false"/>
-                <w:b w:val="false"/>
-                <w:u w:val="none"/>
-                <w:strike w:val="false"/>
-                <w:sz w:val="22"/>
-                <w:szCs w:val="22"/>
-                <w:color w:val="000000"/>
-              </w:rPr>
-            </w:pPr>
-            <w:r>
-              <w:rPr>
-                <w:rFonts w:ascii="Arial" w:hAnsi="Arial" w:eastAsia="Arial" w:cs="Arial"/>
-                <w:i w:val="false"/>
-                <w:b w:val="false"/>
-                <w:u w:val="none"/>
-                <w:strike w:val="false"/>
-                <w:sz w:val="22"/>
-                <w:szCs w:val="22"/>
-                <w:color w:val="000000"/>
-              </w:rPr>
-              <w:t xml:space="preserve">8</w:t>
+              <w:t xml:space="preserve">140</w:t>
+            </w:r>
+          </w:p>
+        </w:tc>
+        <w:tc>
+          <w:tcPr>
+            <w:tcBorders>
+              <w:bottom w:val="none" w:sz="0" w:space="0" w:color="000000"/>
+              <w:top w:val="none" w:sz="0" w:space="0" w:color="000000"/>
+              <w:left w:val="none" w:sz="0" w:space="0" w:color="000000"/>
+              <w:right w:val="none" w:sz="0" w:space="0" w:color="000000"/>
+            </w:tcBorders>
+            <w:shd w:val="clear" w:color="auto" w:fill="FFFFFF"/>
+            <w:tcMar>
+              <w:top w:w="0" w:type="dxa"/>
+              <w:bottom w:w="0" w:type="dxa"/>
+              <w:left w:w="0" w:type="dxa"/>
+              <w:right w:w="0" w:type="dxa"/>
+            </w:tcMar>
+            <w:vAlign w:val="top"/>
+          </w:tcPr>
+          <w:p>
+            <w:pPr>
+              <w:jc w:val="center"/>
+              <w:pBdr>
+                <w:bottom w:val="none" w:sz="0" w:space="0" w:color="000000"/>
+                <w:top w:val="none" w:sz="0" w:space="0" w:color="000000"/>
+                <w:left w:val="none" w:sz="0" w:space="0" w:color="000000"/>
+                <w:right w:val="none" w:sz="0" w:space="0" w:color="000000"/>
+              </w:pBdr>
+              <w:spacing w:after="100" w:before="100" w:line="240"/>
+              <w:ind w:left="100" w:right="100" w:firstLine="0" w:firstLineChars="0"/>
+              <w:rPr>
+                <w:rFonts w:ascii="Arial" w:hAnsi="Arial" w:eastAsia="Arial" w:cs="Arial"/>
+                <w:i w:val="false"/>
+                <w:b w:val="false"/>
+                <w:u w:val="none"/>
+                <w:strike w:val="false"/>
+                <w:sz w:val="22"/>
+                <w:szCs w:val="22"/>
+                <w:color w:val="000000"/>
+              </w:rPr>
+            </w:pPr>
+            <w:r>
+              <w:rPr>
+                <w:rFonts w:ascii="Arial" w:hAnsi="Arial" w:eastAsia="Arial" w:cs="Arial"/>
+                <w:i w:val="false"/>
+                <w:b w:val="false"/>
+                <w:u w:val="none"/>
+                <w:strike w:val="false"/>
+                <w:sz w:val="22"/>
+                <w:szCs w:val="22"/>
+                <w:color w:val="000000"/>
+              </w:rPr>
+              <w:t xml:space="preserve">5</w:t>
             </w:r>
           </w:p>
         </w:tc>
@@ -6948,169 +6948,169 @@
                 <w:szCs w:val="22"/>
                 <w:color w:val="000000"/>
               </w:rPr>
-              <w:t xml:space="preserve">815 (37%)</w:t>
-            </w:r>
-          </w:p>
-        </w:tc>
-        <w:tc>
-          <w:tcPr>
-            <w:tcBorders>
-              <w:bottom w:val="none" w:sz="0" w:space="0" w:color="000000"/>
-              <w:top w:val="none" w:sz="0" w:space="0" w:color="000000"/>
-              <w:left w:val="none" w:sz="0" w:space="0" w:color="000000"/>
-              <w:right w:val="none" w:sz="0" w:space="0" w:color="000000"/>
-            </w:tcBorders>
-            <w:shd w:val="clear" w:color="auto" w:fill="FFFFFF"/>
-            <w:tcMar>
-              <w:top w:w="0" w:type="dxa"/>
-              <w:bottom w:w="0" w:type="dxa"/>
-              <w:left w:w="0" w:type="dxa"/>
-              <w:right w:w="0" w:type="dxa"/>
-            </w:tcMar>
-            <w:vAlign w:val="top"/>
-          </w:tcPr>
-          <w:p>
-            <w:pPr>
-              <w:jc w:val="center"/>
-              <w:pBdr>
-                <w:bottom w:val="none" w:sz="0" w:space="0" w:color="000000"/>
-                <w:top w:val="none" w:sz="0" w:space="0" w:color="000000"/>
-                <w:left w:val="none" w:sz="0" w:space="0" w:color="000000"/>
-                <w:right w:val="none" w:sz="0" w:space="0" w:color="000000"/>
-              </w:pBdr>
-              <w:spacing w:after="100" w:before="100" w:line="240"/>
-              <w:ind w:left="100" w:right="100" w:firstLine="0" w:firstLineChars="0"/>
-              <w:rPr>
-                <w:rFonts w:ascii="Arial" w:hAnsi="Arial" w:eastAsia="Arial" w:cs="Arial"/>
-                <w:i w:val="false"/>
-                <w:b w:val="false"/>
-                <w:u w:val="none"/>
-                <w:strike w:val="false"/>
-                <w:sz w:val="22"/>
-                <w:szCs w:val="22"/>
-                <w:color w:val="000000"/>
-              </w:rPr>
-            </w:pPr>
-            <w:r>
-              <w:rPr>
-                <w:rFonts w:ascii="Arial" w:hAnsi="Arial" w:eastAsia="Arial" w:cs="Arial"/>
-                <w:i w:val="false"/>
-                <w:b w:val="false"/>
-                <w:u w:val="none"/>
-                <w:strike w:val="false"/>
-                <w:sz w:val="22"/>
-                <w:szCs w:val="22"/>
-                <w:color w:val="000000"/>
-              </w:rPr>
-              <w:t xml:space="preserve">711 (36%)</w:t>
-            </w:r>
-          </w:p>
-        </w:tc>
-        <w:tc>
-          <w:tcPr>
-            <w:tcBorders>
-              <w:bottom w:val="none" w:sz="0" w:space="0" w:color="000000"/>
-              <w:top w:val="none" w:sz="0" w:space="0" w:color="000000"/>
-              <w:left w:val="none" w:sz="0" w:space="0" w:color="000000"/>
-              <w:right w:val="none" w:sz="0" w:space="0" w:color="000000"/>
-            </w:tcBorders>
-            <w:shd w:val="clear" w:color="auto" w:fill="FFFFFF"/>
-            <w:tcMar>
-              <w:top w:w="0" w:type="dxa"/>
-              <w:bottom w:w="0" w:type="dxa"/>
-              <w:left w:w="0" w:type="dxa"/>
-              <w:right w:w="0" w:type="dxa"/>
-            </w:tcMar>
-            <w:vAlign w:val="top"/>
-          </w:tcPr>
-          <w:p>
-            <w:pPr>
-              <w:jc w:val="center"/>
-              <w:pBdr>
-                <w:bottom w:val="none" w:sz="0" w:space="0" w:color="000000"/>
-                <w:top w:val="none" w:sz="0" w:space="0" w:color="000000"/>
-                <w:left w:val="none" w:sz="0" w:space="0" w:color="000000"/>
-                <w:right w:val="none" w:sz="0" w:space="0" w:color="000000"/>
-              </w:pBdr>
-              <w:spacing w:after="100" w:before="100" w:line="240"/>
-              <w:ind w:left="100" w:right="100" w:firstLine="0" w:firstLineChars="0"/>
-              <w:rPr>
-                <w:rFonts w:ascii="Arial" w:hAnsi="Arial" w:eastAsia="Arial" w:cs="Arial"/>
-                <w:i w:val="false"/>
-                <w:b w:val="false"/>
-                <w:u w:val="none"/>
-                <w:strike w:val="false"/>
-                <w:sz w:val="22"/>
-                <w:szCs w:val="22"/>
-                <w:color w:val="000000"/>
-              </w:rPr>
-            </w:pPr>
-            <w:r>
-              <w:rPr>
-                <w:rFonts w:ascii="Arial" w:hAnsi="Arial" w:eastAsia="Arial" w:cs="Arial"/>
-                <w:i w:val="false"/>
-                <w:b w:val="false"/>
-                <w:u w:val="none"/>
-                <w:strike w:val="false"/>
-                <w:sz w:val="22"/>
-                <w:szCs w:val="22"/>
-                <w:color w:val="000000"/>
-              </w:rPr>
-              <w:t xml:space="preserve">104 (39%)</w:t>
-            </w:r>
-          </w:p>
-        </w:tc>
-        <w:tc>
-          <w:tcPr>
-            <w:tcBorders>
-              <w:bottom w:val="none" w:sz="0" w:space="0" w:color="000000"/>
-              <w:top w:val="none" w:sz="0" w:space="0" w:color="000000"/>
-              <w:left w:val="none" w:sz="0" w:space="0" w:color="000000"/>
-              <w:right w:val="none" w:sz="0" w:space="0" w:color="000000"/>
-            </w:tcBorders>
-            <w:shd w:val="clear" w:color="auto" w:fill="FFFFFF"/>
-            <w:tcMar>
-              <w:top w:w="0" w:type="dxa"/>
-              <w:bottom w:w="0" w:type="dxa"/>
-              <w:left w:w="0" w:type="dxa"/>
-              <w:right w:w="0" w:type="dxa"/>
-            </w:tcMar>
-            <w:vAlign w:val="top"/>
-          </w:tcPr>
-          <w:p>
-            <w:pPr>
-              <w:jc w:val="center"/>
-              <w:pBdr>
-                <w:bottom w:val="none" w:sz="0" w:space="0" w:color="000000"/>
-                <w:top w:val="none" w:sz="0" w:space="0" w:color="000000"/>
-                <w:left w:val="none" w:sz="0" w:space="0" w:color="000000"/>
-                <w:right w:val="none" w:sz="0" w:space="0" w:color="000000"/>
-              </w:pBdr>
-              <w:spacing w:after="100" w:before="100" w:line="240"/>
-              <w:ind w:left="100" w:right="100" w:firstLine="0" w:firstLineChars="0"/>
-              <w:rPr>
-                <w:rFonts w:ascii="Arial" w:hAnsi="Arial" w:eastAsia="Arial" w:cs="Arial"/>
-                <w:i w:val="false"/>
-                <w:b w:val="false"/>
-                <w:u w:val="none"/>
-                <w:strike w:val="false"/>
-                <w:sz w:val="22"/>
-                <w:szCs w:val="22"/>
-                <w:color w:val="000000"/>
-              </w:rPr>
-            </w:pPr>
-            <w:r>
-              <w:rPr>
-                <w:rFonts w:ascii="Arial" w:hAnsi="Arial" w:eastAsia="Arial" w:cs="Arial"/>
-                <w:i w:val="false"/>
-                <w:b w:val="false"/>
-                <w:u w:val="none"/>
-                <w:strike w:val="false"/>
-                <w:sz w:val="22"/>
-                <w:szCs w:val="22"/>
-                <w:color w:val="000000"/>
-              </w:rPr>
-              <w:t xml:space="preserve">0.4</w:t>
+              <w:t xml:space="preserve">816 (37%)</w:t>
+            </w:r>
+          </w:p>
+        </w:tc>
+        <w:tc>
+          <w:tcPr>
+            <w:tcBorders>
+              <w:bottom w:val="none" w:sz="0" w:space="0" w:color="000000"/>
+              <w:top w:val="none" w:sz="0" w:space="0" w:color="000000"/>
+              <w:left w:val="none" w:sz="0" w:space="0" w:color="000000"/>
+              <w:right w:val="none" w:sz="0" w:space="0" w:color="000000"/>
+            </w:tcBorders>
+            <w:shd w:val="clear" w:color="auto" w:fill="FFFFFF"/>
+            <w:tcMar>
+              <w:top w:w="0" w:type="dxa"/>
+              <w:bottom w:w="0" w:type="dxa"/>
+              <w:left w:w="0" w:type="dxa"/>
+              <w:right w:w="0" w:type="dxa"/>
+            </w:tcMar>
+            <w:vAlign w:val="top"/>
+          </w:tcPr>
+          <w:p>
+            <w:pPr>
+              <w:jc w:val="center"/>
+              <w:pBdr>
+                <w:bottom w:val="none" w:sz="0" w:space="0" w:color="000000"/>
+                <w:top w:val="none" w:sz="0" w:space="0" w:color="000000"/>
+                <w:left w:val="none" w:sz="0" w:space="0" w:color="000000"/>
+                <w:right w:val="none" w:sz="0" w:space="0" w:color="000000"/>
+              </w:pBdr>
+              <w:spacing w:after="100" w:before="100" w:line="240"/>
+              <w:ind w:left="100" w:right="100" w:firstLine="0" w:firstLineChars="0"/>
+              <w:rPr>
+                <w:rFonts w:ascii="Arial" w:hAnsi="Arial" w:eastAsia="Arial" w:cs="Arial"/>
+                <w:i w:val="false"/>
+                <w:b w:val="false"/>
+                <w:u w:val="none"/>
+                <w:strike w:val="false"/>
+                <w:sz w:val="22"/>
+                <w:szCs w:val="22"/>
+                <w:color w:val="000000"/>
+              </w:rPr>
+            </w:pPr>
+            <w:r>
+              <w:rPr>
+                <w:rFonts w:ascii="Arial" w:hAnsi="Arial" w:eastAsia="Arial" w:cs="Arial"/>
+                <w:i w:val="false"/>
+                <w:b w:val="false"/>
+                <w:u w:val="none"/>
+                <w:strike w:val="false"/>
+                <w:sz w:val="22"/>
+                <w:szCs w:val="22"/>
+                <w:color w:val="000000"/>
+              </w:rPr>
+              <w:t xml:space="preserve">715 (36%)</w:t>
+            </w:r>
+          </w:p>
+        </w:tc>
+        <w:tc>
+          <w:tcPr>
+            <w:tcBorders>
+              <w:bottom w:val="none" w:sz="0" w:space="0" w:color="000000"/>
+              <w:top w:val="none" w:sz="0" w:space="0" w:color="000000"/>
+              <w:left w:val="none" w:sz="0" w:space="0" w:color="000000"/>
+              <w:right w:val="none" w:sz="0" w:space="0" w:color="000000"/>
+            </w:tcBorders>
+            <w:shd w:val="clear" w:color="auto" w:fill="FFFFFF"/>
+            <w:tcMar>
+              <w:top w:w="0" w:type="dxa"/>
+              <w:bottom w:w="0" w:type="dxa"/>
+              <w:left w:w="0" w:type="dxa"/>
+              <w:right w:w="0" w:type="dxa"/>
+            </w:tcMar>
+            <w:vAlign w:val="top"/>
+          </w:tcPr>
+          <w:p>
+            <w:pPr>
+              <w:jc w:val="center"/>
+              <w:pBdr>
+                <w:bottom w:val="none" w:sz="0" w:space="0" w:color="000000"/>
+                <w:top w:val="none" w:sz="0" w:space="0" w:color="000000"/>
+                <w:left w:val="none" w:sz="0" w:space="0" w:color="000000"/>
+                <w:right w:val="none" w:sz="0" w:space="0" w:color="000000"/>
+              </w:pBdr>
+              <w:spacing w:after="100" w:before="100" w:line="240"/>
+              <w:ind w:left="100" w:right="100" w:firstLine="0" w:firstLineChars="0"/>
+              <w:rPr>
+                <w:rFonts w:ascii="Arial" w:hAnsi="Arial" w:eastAsia="Arial" w:cs="Arial"/>
+                <w:i w:val="false"/>
+                <w:b w:val="false"/>
+                <w:u w:val="none"/>
+                <w:strike w:val="false"/>
+                <w:sz w:val="22"/>
+                <w:szCs w:val="22"/>
+                <w:color w:val="000000"/>
+              </w:rPr>
+            </w:pPr>
+            <w:r>
+              <w:rPr>
+                <w:rFonts w:ascii="Arial" w:hAnsi="Arial" w:eastAsia="Arial" w:cs="Arial"/>
+                <w:i w:val="false"/>
+                <w:b w:val="false"/>
+                <w:u w:val="none"/>
+                <w:strike w:val="false"/>
+                <w:sz w:val="22"/>
+                <w:szCs w:val="22"/>
+                <w:color w:val="000000"/>
+              </w:rPr>
+              <w:t xml:space="preserve">101 (39%)</w:t>
+            </w:r>
+          </w:p>
+        </w:tc>
+        <w:tc>
+          <w:tcPr>
+            <w:tcBorders>
+              <w:bottom w:val="none" w:sz="0" w:space="0" w:color="000000"/>
+              <w:top w:val="none" w:sz="0" w:space="0" w:color="000000"/>
+              <w:left w:val="none" w:sz="0" w:space="0" w:color="000000"/>
+              <w:right w:val="none" w:sz="0" w:space="0" w:color="000000"/>
+            </w:tcBorders>
+            <w:shd w:val="clear" w:color="auto" w:fill="FFFFFF"/>
+            <w:tcMar>
+              <w:top w:w="0" w:type="dxa"/>
+              <w:bottom w:w="0" w:type="dxa"/>
+              <w:left w:w="0" w:type="dxa"/>
+              <w:right w:w="0" w:type="dxa"/>
+            </w:tcMar>
+            <w:vAlign w:val="top"/>
+          </w:tcPr>
+          <w:p>
+            <w:pPr>
+              <w:jc w:val="center"/>
+              <w:pBdr>
+                <w:bottom w:val="none" w:sz="0" w:space="0" w:color="000000"/>
+                <w:top w:val="none" w:sz="0" w:space="0" w:color="000000"/>
+                <w:left w:val="none" w:sz="0" w:space="0" w:color="000000"/>
+                <w:right w:val="none" w:sz="0" w:space="0" w:color="000000"/>
+              </w:pBdr>
+              <w:spacing w:after="100" w:before="100" w:line="240"/>
+              <w:ind w:left="100" w:right="100" w:firstLine="0" w:firstLineChars="0"/>
+              <w:rPr>
+                <w:rFonts w:ascii="Arial" w:hAnsi="Arial" w:eastAsia="Arial" w:cs="Arial"/>
+                <w:i w:val="false"/>
+                <w:b w:val="false"/>
+                <w:u w:val="none"/>
+                <w:strike w:val="false"/>
+                <w:sz w:val="22"/>
+                <w:szCs w:val="22"/>
+                <w:color w:val="000000"/>
+              </w:rPr>
+            </w:pPr>
+            <w:r>
+              <w:rPr>
+                <w:rFonts w:ascii="Arial" w:hAnsi="Arial" w:eastAsia="Arial" w:cs="Arial"/>
+                <w:i w:val="false"/>
+                <w:b w:val="false"/>
+                <w:u w:val="none"/>
+                <w:strike w:val="false"/>
+                <w:sz w:val="22"/>
+                <w:szCs w:val="22"/>
+                <w:color w:val="000000"/>
+              </w:rPr>
+              <w:t xml:space="preserve">0.5</w:t>
             </w:r>
           </w:p>
         </w:tc>
@@ -7224,115 +7224,115 @@
                 <w:szCs w:val="22"/>
                 <w:color w:val="000000"/>
               </w:rPr>
-              <w:t xml:space="preserve">1,020 (47%)</w:t>
-            </w:r>
-          </w:p>
-        </w:tc>
-        <w:tc>
-          <w:tcPr>
-            <w:tcBorders>
-              <w:bottom w:val="none" w:sz="0" w:space="0" w:color="000000"/>
-              <w:top w:val="none" w:sz="0" w:space="0" w:color="000000"/>
-              <w:left w:val="none" w:sz="0" w:space="0" w:color="000000"/>
-              <w:right w:val="none" w:sz="0" w:space="0" w:color="000000"/>
-            </w:tcBorders>
-            <w:shd w:val="clear" w:color="auto" w:fill="FFFFFF"/>
-            <w:tcMar>
-              <w:top w:w="0" w:type="dxa"/>
-              <w:bottom w:w="0" w:type="dxa"/>
-              <w:left w:w="0" w:type="dxa"/>
-              <w:right w:w="0" w:type="dxa"/>
-            </w:tcMar>
-            <w:vAlign w:val="top"/>
-          </w:tcPr>
-          <w:p>
-            <w:pPr>
-              <w:jc w:val="center"/>
-              <w:pBdr>
-                <w:bottom w:val="none" w:sz="0" w:space="0" w:color="000000"/>
-                <w:top w:val="none" w:sz="0" w:space="0" w:color="000000"/>
-                <w:left w:val="none" w:sz="0" w:space="0" w:color="000000"/>
-                <w:right w:val="none" w:sz="0" w:space="0" w:color="000000"/>
-              </w:pBdr>
-              <w:spacing w:after="100" w:before="100" w:line="240"/>
-              <w:ind w:left="100" w:right="100" w:firstLine="0" w:firstLineChars="0"/>
-              <w:rPr>
-                <w:rFonts w:ascii="Arial" w:hAnsi="Arial" w:eastAsia="Arial" w:cs="Arial"/>
-                <w:i w:val="false"/>
-                <w:b w:val="false"/>
-                <w:u w:val="none"/>
-                <w:strike w:val="false"/>
-                <w:sz w:val="22"/>
-                <w:szCs w:val="22"/>
-                <w:color w:val="000000"/>
-              </w:rPr>
-            </w:pPr>
-            <w:r>
-              <w:rPr>
-                <w:rFonts w:ascii="Arial" w:hAnsi="Arial" w:eastAsia="Arial" w:cs="Arial"/>
-                <w:i w:val="false"/>
-                <w:b w:val="false"/>
-                <w:u w:val="none"/>
-                <w:strike w:val="false"/>
-                <w:sz w:val="22"/>
-                <w:szCs w:val="22"/>
-                <w:color w:val="000000"/>
-              </w:rPr>
-              <w:t xml:space="preserve">896 (47%)</w:t>
-            </w:r>
-          </w:p>
-        </w:tc>
-        <w:tc>
-          <w:tcPr>
-            <w:tcBorders>
-              <w:bottom w:val="none" w:sz="0" w:space="0" w:color="000000"/>
-              <w:top w:val="none" w:sz="0" w:space="0" w:color="000000"/>
-              <w:left w:val="none" w:sz="0" w:space="0" w:color="000000"/>
-              <w:right w:val="none" w:sz="0" w:space="0" w:color="000000"/>
-            </w:tcBorders>
-            <w:shd w:val="clear" w:color="auto" w:fill="FFFFFF"/>
-            <w:tcMar>
-              <w:top w:w="0" w:type="dxa"/>
-              <w:bottom w:w="0" w:type="dxa"/>
-              <w:left w:w="0" w:type="dxa"/>
-              <w:right w:w="0" w:type="dxa"/>
-            </w:tcMar>
-            <w:vAlign w:val="top"/>
-          </w:tcPr>
-          <w:p>
-            <w:pPr>
-              <w:jc w:val="center"/>
-              <w:pBdr>
-                <w:bottom w:val="none" w:sz="0" w:space="0" w:color="000000"/>
-                <w:top w:val="none" w:sz="0" w:space="0" w:color="000000"/>
-                <w:left w:val="none" w:sz="0" w:space="0" w:color="000000"/>
-                <w:right w:val="none" w:sz="0" w:space="0" w:color="000000"/>
-              </w:pBdr>
-              <w:spacing w:after="100" w:before="100" w:line="240"/>
-              <w:ind w:left="100" w:right="100" w:firstLine="0" w:firstLineChars="0"/>
-              <w:rPr>
-                <w:rFonts w:ascii="Arial" w:hAnsi="Arial" w:eastAsia="Arial" w:cs="Arial"/>
-                <w:i w:val="false"/>
-                <w:b w:val="false"/>
-                <w:u w:val="none"/>
-                <w:strike w:val="false"/>
-                <w:sz w:val="22"/>
-                <w:szCs w:val="22"/>
-                <w:color w:val="000000"/>
-              </w:rPr>
-            </w:pPr>
-            <w:r>
-              <w:rPr>
-                <w:rFonts w:ascii="Arial" w:hAnsi="Arial" w:eastAsia="Arial" w:cs="Arial"/>
-                <w:i w:val="false"/>
-                <w:b w:val="false"/>
-                <w:u w:val="none"/>
-                <w:strike w:val="false"/>
-                <w:sz w:val="22"/>
-                <w:szCs w:val="22"/>
-                <w:color w:val="000000"/>
-              </w:rPr>
-              <w:t xml:space="preserve">124 (47%)</w:t>
+              <w:t xml:space="preserve">1,021 (47%)</w:t>
+            </w:r>
+          </w:p>
+        </w:tc>
+        <w:tc>
+          <w:tcPr>
+            <w:tcBorders>
+              <w:bottom w:val="none" w:sz="0" w:space="0" w:color="000000"/>
+              <w:top w:val="none" w:sz="0" w:space="0" w:color="000000"/>
+              <w:left w:val="none" w:sz="0" w:space="0" w:color="000000"/>
+              <w:right w:val="none" w:sz="0" w:space="0" w:color="000000"/>
+            </w:tcBorders>
+            <w:shd w:val="clear" w:color="auto" w:fill="FFFFFF"/>
+            <w:tcMar>
+              <w:top w:w="0" w:type="dxa"/>
+              <w:bottom w:w="0" w:type="dxa"/>
+              <w:left w:w="0" w:type="dxa"/>
+              <w:right w:w="0" w:type="dxa"/>
+            </w:tcMar>
+            <w:vAlign w:val="top"/>
+          </w:tcPr>
+          <w:p>
+            <w:pPr>
+              <w:jc w:val="center"/>
+              <w:pBdr>
+                <w:bottom w:val="none" w:sz="0" w:space="0" w:color="000000"/>
+                <w:top w:val="none" w:sz="0" w:space="0" w:color="000000"/>
+                <w:left w:val="none" w:sz="0" w:space="0" w:color="000000"/>
+                <w:right w:val="none" w:sz="0" w:space="0" w:color="000000"/>
+              </w:pBdr>
+              <w:spacing w:after="100" w:before="100" w:line="240"/>
+              <w:ind w:left="100" w:right="100" w:firstLine="0" w:firstLineChars="0"/>
+              <w:rPr>
+                <w:rFonts w:ascii="Arial" w:hAnsi="Arial" w:eastAsia="Arial" w:cs="Arial"/>
+                <w:i w:val="false"/>
+                <w:b w:val="false"/>
+                <w:u w:val="none"/>
+                <w:strike w:val="false"/>
+                <w:sz w:val="22"/>
+                <w:szCs w:val="22"/>
+                <w:color w:val="000000"/>
+              </w:rPr>
+            </w:pPr>
+            <w:r>
+              <w:rPr>
+                <w:rFonts w:ascii="Arial" w:hAnsi="Arial" w:eastAsia="Arial" w:cs="Arial"/>
+                <w:i w:val="false"/>
+                <w:b w:val="false"/>
+                <w:u w:val="none"/>
+                <w:strike w:val="false"/>
+                <w:sz w:val="22"/>
+                <w:szCs w:val="22"/>
+                <w:color w:val="000000"/>
+              </w:rPr>
+              <w:t xml:space="preserve">900 (47%)</w:t>
+            </w:r>
+          </w:p>
+        </w:tc>
+        <w:tc>
+          <w:tcPr>
+            <w:tcBorders>
+              <w:bottom w:val="none" w:sz="0" w:space="0" w:color="000000"/>
+              <w:top w:val="none" w:sz="0" w:space="0" w:color="000000"/>
+              <w:left w:val="none" w:sz="0" w:space="0" w:color="000000"/>
+              <w:right w:val="none" w:sz="0" w:space="0" w:color="000000"/>
+            </w:tcBorders>
+            <w:shd w:val="clear" w:color="auto" w:fill="FFFFFF"/>
+            <w:tcMar>
+              <w:top w:w="0" w:type="dxa"/>
+              <w:bottom w:w="0" w:type="dxa"/>
+              <w:left w:w="0" w:type="dxa"/>
+              <w:right w:w="0" w:type="dxa"/>
+            </w:tcMar>
+            <w:vAlign w:val="top"/>
+          </w:tcPr>
+          <w:p>
+            <w:pPr>
+              <w:jc w:val="center"/>
+              <w:pBdr>
+                <w:bottom w:val="none" w:sz="0" w:space="0" w:color="000000"/>
+                <w:top w:val="none" w:sz="0" w:space="0" w:color="000000"/>
+                <w:left w:val="none" w:sz="0" w:space="0" w:color="000000"/>
+                <w:right w:val="none" w:sz="0" w:space="0" w:color="000000"/>
+              </w:pBdr>
+              <w:spacing w:after="100" w:before="100" w:line="240"/>
+              <w:ind w:left="100" w:right="100" w:firstLine="0" w:firstLineChars="0"/>
+              <w:rPr>
+                <w:rFonts w:ascii="Arial" w:hAnsi="Arial" w:eastAsia="Arial" w:cs="Arial"/>
+                <w:i w:val="false"/>
+                <w:b w:val="false"/>
+                <w:u w:val="none"/>
+                <w:strike w:val="false"/>
+                <w:sz w:val="22"/>
+                <w:szCs w:val="22"/>
+                <w:color w:val="000000"/>
+              </w:rPr>
+            </w:pPr>
+            <w:r>
+              <w:rPr>
+                <w:rFonts w:ascii="Arial" w:hAnsi="Arial" w:eastAsia="Arial" w:cs="Arial"/>
+                <w:i w:val="false"/>
+                <w:b w:val="false"/>
+                <w:u w:val="none"/>
+                <w:strike w:val="false"/>
+                <w:sz w:val="22"/>
+                <w:szCs w:val="22"/>
+                <w:color w:val="000000"/>
+              </w:rPr>
+              <w:t xml:space="preserve">121 (47%)</w:t>
             </w:r>
           </w:p>
         </w:tc>
@@ -7393,7 +7393,7 @@
       </w:tr>
       <w:tr>
         <w:trPr>
-          <w:trHeight w:val="572" w:hRule="auto"/>
+          <w:trHeight w:val="571" w:hRule="auto"/>
         </w:trPr>
         body26
         <w:tc>
@@ -7500,61 +7500,61 @@
                 <w:szCs w:val="22"/>
                 <w:color w:val="000000"/>
               </w:rPr>
-              <w:t xml:space="preserve">63</w:t>
-            </w:r>
-          </w:p>
-        </w:tc>
-        <w:tc>
-          <w:tcPr>
-            <w:tcBorders>
-              <w:bottom w:val="none" w:sz="0" w:space="0" w:color="000000"/>
-              <w:top w:val="none" w:sz="0" w:space="0" w:color="000000"/>
-              <w:left w:val="none" w:sz="0" w:space="0" w:color="000000"/>
-              <w:right w:val="none" w:sz="0" w:space="0" w:color="000000"/>
-            </w:tcBorders>
-            <w:shd w:val="clear" w:color="auto" w:fill="FFFFFF"/>
-            <w:tcMar>
-              <w:top w:w="0" w:type="dxa"/>
-              <w:bottom w:w="0" w:type="dxa"/>
-              <w:left w:w="0" w:type="dxa"/>
-              <w:right w:w="0" w:type="dxa"/>
-            </w:tcMar>
-            <w:vAlign w:val="top"/>
-          </w:tcPr>
-          <w:p>
-            <w:pPr>
-              <w:jc w:val="center"/>
-              <w:pBdr>
-                <w:bottom w:val="none" w:sz="0" w:space="0" w:color="000000"/>
-                <w:top w:val="none" w:sz="0" w:space="0" w:color="000000"/>
-                <w:left w:val="none" w:sz="0" w:space="0" w:color="000000"/>
-                <w:right w:val="none" w:sz="0" w:space="0" w:color="000000"/>
-              </w:pBdr>
-              <w:spacing w:after="100" w:before="100" w:line="240"/>
-              <w:ind w:left="100" w:right="100" w:firstLine="0" w:firstLineChars="0"/>
-              <w:rPr>
-                <w:rFonts w:ascii="Arial" w:hAnsi="Arial" w:eastAsia="Arial" w:cs="Arial"/>
-                <w:i w:val="false"/>
-                <w:b w:val="false"/>
-                <w:u w:val="none"/>
-                <w:strike w:val="false"/>
-                <w:sz w:val="22"/>
-                <w:szCs w:val="22"/>
-                <w:color w:val="000000"/>
-              </w:rPr>
-            </w:pPr>
-            <w:r>
-              <w:rPr>
-                <w:rFonts w:ascii="Arial" w:hAnsi="Arial" w:eastAsia="Arial" w:cs="Arial"/>
-                <w:i w:val="false"/>
-                <w:b w:val="false"/>
-                <w:u w:val="none"/>
-                <w:strike w:val="false"/>
-                <w:sz w:val="22"/>
-                <w:szCs w:val="22"/>
-                <w:color w:val="000000"/>
-              </w:rPr>
-              <w:t xml:space="preserve">59</w:t>
+              <w:t xml:space="preserve">62</w:t>
+            </w:r>
+          </w:p>
+        </w:tc>
+        <w:tc>
+          <w:tcPr>
+            <w:tcBorders>
+              <w:bottom w:val="none" w:sz="0" w:space="0" w:color="000000"/>
+              <w:top w:val="none" w:sz="0" w:space="0" w:color="000000"/>
+              <w:left w:val="none" w:sz="0" w:space="0" w:color="000000"/>
+              <w:right w:val="none" w:sz="0" w:space="0" w:color="000000"/>
+            </w:tcBorders>
+            <w:shd w:val="clear" w:color="auto" w:fill="FFFFFF"/>
+            <w:tcMar>
+              <w:top w:w="0" w:type="dxa"/>
+              <w:bottom w:w="0" w:type="dxa"/>
+              <w:left w:w="0" w:type="dxa"/>
+              <w:right w:w="0" w:type="dxa"/>
+            </w:tcMar>
+            <w:vAlign w:val="top"/>
+          </w:tcPr>
+          <w:p>
+            <w:pPr>
+              <w:jc w:val="center"/>
+              <w:pBdr>
+                <w:bottom w:val="none" w:sz="0" w:space="0" w:color="000000"/>
+                <w:top w:val="none" w:sz="0" w:space="0" w:color="000000"/>
+                <w:left w:val="none" w:sz="0" w:space="0" w:color="000000"/>
+                <w:right w:val="none" w:sz="0" w:space="0" w:color="000000"/>
+              </w:pBdr>
+              <w:spacing w:after="100" w:before="100" w:line="240"/>
+              <w:ind w:left="100" w:right="100" w:firstLine="0" w:firstLineChars="0"/>
+              <w:rPr>
+                <w:rFonts w:ascii="Arial" w:hAnsi="Arial" w:eastAsia="Arial" w:cs="Arial"/>
+                <w:i w:val="false"/>
+                <w:b w:val="false"/>
+                <w:u w:val="none"/>
+                <w:strike w:val="false"/>
+                <w:sz w:val="22"/>
+                <w:szCs w:val="22"/>
+                <w:color w:val="000000"/>
+              </w:rPr>
+            </w:pPr>
+            <w:r>
+              <w:rPr>
+                <w:rFonts w:ascii="Arial" w:hAnsi="Arial" w:eastAsia="Arial" w:cs="Arial"/>
+                <w:i w:val="false"/>
+                <w:b w:val="false"/>
+                <w:u w:val="none"/>
+                <w:strike w:val="false"/>
+                <w:sz w:val="22"/>
+                <w:szCs w:val="22"/>
+                <w:color w:val="000000"/>
+              </w:rPr>
+              <w:t xml:space="preserve">58</w:t>
             </w:r>
           </w:p>
         </w:tc>
@@ -8106,7 +8106,7 @@
                 <w:szCs w:val="22"/>
                 <w:color w:val="000000"/>
               </w:rPr>
-              <w:t xml:space="preserve">1,794 (92%)</w:t>
+              <w:t xml:space="preserve">1,794 (91%)</w:t>
             </w:r>
           </w:p>
         </w:tc>
@@ -8436,7 +8436,7 @@
                 <w:szCs w:val="22"/>
                 <w:color w:val="000000"/>
               </w:rPr>
-              <w:t xml:space="preserve">16 (6.0%)</w:t>
+              <w:t xml:space="preserve">16 (6.2%)</w:t>
             </w:r>
           </w:p>
         </w:tc>
@@ -8934,61 +8934,61 @@
                 <w:szCs w:val="22"/>
                 <w:color w:val="000000"/>
               </w:rPr>
-              <w:t xml:space="preserve">1 (&lt;0.1%)</w:t>
-            </w:r>
-          </w:p>
-        </w:tc>
-        <w:tc>
-          <w:tcPr>
-            <w:tcBorders>
-              <w:bottom w:val="none" w:sz="0" w:space="0" w:color="000000"/>
-              <w:top w:val="none" w:sz="0" w:space="0" w:color="000000"/>
-              <w:left w:val="none" w:sz="0" w:space="0" w:color="000000"/>
-              <w:right w:val="none" w:sz="0" w:space="0" w:color="000000"/>
-            </w:tcBorders>
-            <w:shd w:val="clear" w:color="auto" w:fill="FFFFFF"/>
-            <w:tcMar>
-              <w:top w:w="0" w:type="dxa"/>
-              <w:bottom w:w="0" w:type="dxa"/>
-              <w:left w:w="0" w:type="dxa"/>
-              <w:right w:w="0" w:type="dxa"/>
-            </w:tcMar>
-            <w:vAlign w:val="top"/>
-          </w:tcPr>
-          <w:p>
-            <w:pPr>
-              <w:jc w:val="center"/>
-              <w:pBdr>
-                <w:bottom w:val="none" w:sz="0" w:space="0" w:color="000000"/>
-                <w:top w:val="none" w:sz="0" w:space="0" w:color="000000"/>
-                <w:left w:val="none" w:sz="0" w:space="0" w:color="000000"/>
-                <w:right w:val="none" w:sz="0" w:space="0" w:color="000000"/>
-              </w:pBdr>
-              <w:spacing w:after="100" w:before="100" w:line="240"/>
-              <w:ind w:left="100" w:right="100" w:firstLine="0" w:firstLineChars="0"/>
-              <w:rPr>
-                <w:rFonts w:ascii="Arial" w:hAnsi="Arial" w:eastAsia="Arial" w:cs="Arial"/>
-                <w:i w:val="false"/>
-                <w:b w:val="false"/>
-                <w:u w:val="none"/>
-                <w:strike w:val="false"/>
-                <w:sz w:val="22"/>
-                <w:szCs w:val="22"/>
-                <w:color w:val="000000"/>
-              </w:rPr>
-            </w:pPr>
-            <w:r>
-              <w:rPr>
-                <w:rFonts w:ascii="Arial" w:hAnsi="Arial" w:eastAsia="Arial" w:cs="Arial"/>
-                <w:i w:val="false"/>
-                <w:b w:val="false"/>
-                <w:u w:val="none"/>
-                <w:strike w:val="false"/>
-                <w:sz w:val="22"/>
-                <w:szCs w:val="22"/>
-                <w:color w:val="000000"/>
-              </w:rPr>
-              <w:t xml:space="preserve">10 (3.8%)</w:t>
+              <w:t xml:space="preserve">7 (0.4%)</w:t>
+            </w:r>
+          </w:p>
+        </w:tc>
+        <w:tc>
+          <w:tcPr>
+            <w:tcBorders>
+              <w:bottom w:val="none" w:sz="0" w:space="0" w:color="000000"/>
+              <w:top w:val="none" w:sz="0" w:space="0" w:color="000000"/>
+              <w:left w:val="none" w:sz="0" w:space="0" w:color="000000"/>
+              <w:right w:val="none" w:sz="0" w:space="0" w:color="000000"/>
+            </w:tcBorders>
+            <w:shd w:val="clear" w:color="auto" w:fill="FFFFFF"/>
+            <w:tcMar>
+              <w:top w:w="0" w:type="dxa"/>
+              <w:bottom w:w="0" w:type="dxa"/>
+              <w:left w:w="0" w:type="dxa"/>
+              <w:right w:w="0" w:type="dxa"/>
+            </w:tcMar>
+            <w:vAlign w:val="top"/>
+          </w:tcPr>
+          <w:p>
+            <w:pPr>
+              <w:jc w:val="center"/>
+              <w:pBdr>
+                <w:bottom w:val="none" w:sz="0" w:space="0" w:color="000000"/>
+                <w:top w:val="none" w:sz="0" w:space="0" w:color="000000"/>
+                <w:left w:val="none" w:sz="0" w:space="0" w:color="000000"/>
+                <w:right w:val="none" w:sz="0" w:space="0" w:color="000000"/>
+              </w:pBdr>
+              <w:spacing w:after="100" w:before="100" w:line="240"/>
+              <w:ind w:left="100" w:right="100" w:firstLine="0" w:firstLineChars="0"/>
+              <w:rPr>
+                <w:rFonts w:ascii="Arial" w:hAnsi="Arial" w:eastAsia="Arial" w:cs="Arial"/>
+                <w:i w:val="false"/>
+                <w:b w:val="false"/>
+                <w:u w:val="none"/>
+                <w:strike w:val="false"/>
+                <w:sz w:val="22"/>
+                <w:szCs w:val="22"/>
+                <w:color w:val="000000"/>
+              </w:rPr>
+            </w:pPr>
+            <w:r>
+              <w:rPr>
+                <w:rFonts w:ascii="Arial" w:hAnsi="Arial" w:eastAsia="Arial" w:cs="Arial"/>
+                <w:i w:val="false"/>
+                <w:b w:val="false"/>
+                <w:u w:val="none"/>
+                <w:strike w:val="false"/>
+                <w:sz w:val="22"/>
+                <w:szCs w:val="22"/>
+                <w:color w:val="000000"/>
+              </w:rPr>
+              <w:t xml:space="preserve">4 (1.5%)</w:t>
             </w:r>
           </w:p>
         </w:tc>
@@ -9264,7 +9264,7 @@
                 <w:szCs w:val="22"/>
                 <w:color w:val="000000"/>
               </w:rPr>
-              <w:t xml:space="preserve">20 (7.5%)</w:t>
+              <w:t xml:space="preserve">20 (7.7%)</w:t>
             </w:r>
           </w:p>
         </w:tc>
@@ -9540,7 +9540,7 @@
                 <w:szCs w:val="22"/>
                 <w:color w:val="000000"/>
               </w:rPr>
-              <w:t xml:space="preserve">117 (44%)</w:t>
+              <w:t xml:space="preserve">117 (45%)</w:t>
             </w:r>
           </w:p>
         </w:tc>
@@ -9816,7 +9816,7 @@
                 <w:szCs w:val="22"/>
                 <w:color w:val="000000"/>
               </w:rPr>
-              <w:t xml:space="preserve">33 (12%)</w:t>
+              <w:t xml:space="preserve">33 (13%)</w:t>
             </w:r>
           </w:p>
         </w:tc>
@@ -10092,7 +10092,7 @@
                 <w:szCs w:val="22"/>
                 <w:color w:val="000000"/>
               </w:rPr>
-              <w:t xml:space="preserve">20 (7.5%)</w:t>
+              <w:t xml:space="preserve">20 (7.7%)</w:t>
             </w:r>
           </w:p>
         </w:tc>
@@ -10422,7 +10422,7 @@
                 <w:szCs w:val="22"/>
                 <w:color w:val="000000"/>
               </w:rPr>
-              <w:t xml:space="preserve">0.002</w:t>
+              <w:t xml:space="preserve">0.003</w:t>
             </w:r>
           </w:p>
         </w:tc>
@@ -10590,61 +10590,61 @@
                 <w:szCs w:val="22"/>
                 <w:color w:val="000000"/>
               </w:rPr>
-              <w:t xml:space="preserve">311 (16%)</w:t>
-            </w:r>
-          </w:p>
-        </w:tc>
-        <w:tc>
-          <w:tcPr>
-            <w:tcBorders>
-              <w:bottom w:val="none" w:sz="0" w:space="0" w:color="000000"/>
-              <w:top w:val="none" w:sz="0" w:space="0" w:color="000000"/>
-              <w:left w:val="none" w:sz="0" w:space="0" w:color="000000"/>
-              <w:right w:val="none" w:sz="0" w:space="0" w:color="000000"/>
-            </w:tcBorders>
-            <w:shd w:val="clear" w:color="auto" w:fill="FFFFFF"/>
-            <w:tcMar>
-              <w:top w:w="0" w:type="dxa"/>
-              <w:bottom w:w="0" w:type="dxa"/>
-              <w:left w:w="0" w:type="dxa"/>
-              <w:right w:w="0" w:type="dxa"/>
-            </w:tcMar>
-            <w:vAlign w:val="top"/>
-          </w:tcPr>
-          <w:p>
-            <w:pPr>
-              <w:jc w:val="center"/>
-              <w:pBdr>
-                <w:bottom w:val="none" w:sz="0" w:space="0" w:color="000000"/>
-                <w:top w:val="none" w:sz="0" w:space="0" w:color="000000"/>
-                <w:left w:val="none" w:sz="0" w:space="0" w:color="000000"/>
-                <w:right w:val="none" w:sz="0" w:space="0" w:color="000000"/>
-              </w:pBdr>
-              <w:spacing w:after="100" w:before="100" w:line="240"/>
-              <w:ind w:left="100" w:right="100" w:firstLine="0" w:firstLineChars="0"/>
-              <w:rPr>
-                <w:rFonts w:ascii="Arial" w:hAnsi="Arial" w:eastAsia="Arial" w:cs="Arial"/>
-                <w:i w:val="false"/>
-                <w:b w:val="false"/>
-                <w:u w:val="none"/>
-                <w:strike w:val="false"/>
-                <w:sz w:val="22"/>
-                <w:szCs w:val="22"/>
-                <w:color w:val="000000"/>
-              </w:rPr>
-            </w:pPr>
-            <w:r>
-              <w:rPr>
-                <w:rFonts w:ascii="Arial" w:hAnsi="Arial" w:eastAsia="Arial" w:cs="Arial"/>
-                <w:i w:val="false"/>
-                <w:b w:val="false"/>
-                <w:u w:val="none"/>
-                <w:strike w:val="false"/>
-                <w:sz w:val="22"/>
-                <w:szCs w:val="22"/>
-                <w:color w:val="000000"/>
-              </w:rPr>
-              <w:t xml:space="preserve">53 (20%)</w:t>
+              <w:t xml:space="preserve">312 (16%)</w:t>
+            </w:r>
+          </w:p>
+        </w:tc>
+        <w:tc>
+          <w:tcPr>
+            <w:tcBorders>
+              <w:bottom w:val="none" w:sz="0" w:space="0" w:color="000000"/>
+              <w:top w:val="none" w:sz="0" w:space="0" w:color="000000"/>
+              <w:left w:val="none" w:sz="0" w:space="0" w:color="000000"/>
+              <w:right w:val="none" w:sz="0" w:space="0" w:color="000000"/>
+            </w:tcBorders>
+            <w:shd w:val="clear" w:color="auto" w:fill="FFFFFF"/>
+            <w:tcMar>
+              <w:top w:w="0" w:type="dxa"/>
+              <w:bottom w:w="0" w:type="dxa"/>
+              <w:left w:w="0" w:type="dxa"/>
+              <w:right w:w="0" w:type="dxa"/>
+            </w:tcMar>
+            <w:vAlign w:val="top"/>
+          </w:tcPr>
+          <w:p>
+            <w:pPr>
+              <w:jc w:val="center"/>
+              <w:pBdr>
+                <w:bottom w:val="none" w:sz="0" w:space="0" w:color="000000"/>
+                <w:top w:val="none" w:sz="0" w:space="0" w:color="000000"/>
+                <w:left w:val="none" w:sz="0" w:space="0" w:color="000000"/>
+                <w:right w:val="none" w:sz="0" w:space="0" w:color="000000"/>
+              </w:pBdr>
+              <w:spacing w:after="100" w:before="100" w:line="240"/>
+              <w:ind w:left="100" w:right="100" w:firstLine="0" w:firstLineChars="0"/>
+              <w:rPr>
+                <w:rFonts w:ascii="Arial" w:hAnsi="Arial" w:eastAsia="Arial" w:cs="Arial"/>
+                <w:i w:val="false"/>
+                <w:b w:val="false"/>
+                <w:u w:val="none"/>
+                <w:strike w:val="false"/>
+                <w:sz w:val="22"/>
+                <w:szCs w:val="22"/>
+                <w:color w:val="000000"/>
+              </w:rPr>
+            </w:pPr>
+            <w:r>
+              <w:rPr>
+                <w:rFonts w:ascii="Arial" w:hAnsi="Arial" w:eastAsia="Arial" w:cs="Arial"/>
+                <w:i w:val="false"/>
+                <w:b w:val="false"/>
+                <w:u w:val="none"/>
+                <w:strike w:val="false"/>
+                <w:sz w:val="22"/>
+                <w:szCs w:val="22"/>
+                <w:color w:val="000000"/>
+              </w:rPr>
+              <w:t xml:space="preserve">52 (20%)</w:t>
             </w:r>
           </w:p>
         </w:tc>
@@ -10866,7 +10866,7 @@
                 <w:szCs w:val="22"/>
                 <w:color w:val="000000"/>
               </w:rPr>
-              <w:t xml:space="preserve">245 (13%)</w:t>
+              <w:t xml:space="preserve">245 (12%)</w:t>
             </w:r>
           </w:p>
         </w:tc>
@@ -11142,61 +11142,61 @@
                 <w:szCs w:val="22"/>
                 <w:color w:val="000000"/>
               </w:rPr>
-              <w:t xml:space="preserve">667 (34%)</w:t>
-            </w:r>
-          </w:p>
-        </w:tc>
-        <w:tc>
-          <w:tcPr>
-            <w:tcBorders>
-              <w:bottom w:val="none" w:sz="0" w:space="0" w:color="000000"/>
-              <w:top w:val="none" w:sz="0" w:space="0" w:color="000000"/>
-              <w:left w:val="none" w:sz="0" w:space="0" w:color="000000"/>
-              <w:right w:val="none" w:sz="0" w:space="0" w:color="000000"/>
-            </w:tcBorders>
-            <w:shd w:val="clear" w:color="auto" w:fill="FFFFFF"/>
-            <w:tcMar>
-              <w:top w:w="0" w:type="dxa"/>
-              <w:bottom w:w="0" w:type="dxa"/>
-              <w:left w:w="0" w:type="dxa"/>
-              <w:right w:w="0" w:type="dxa"/>
-            </w:tcMar>
-            <w:vAlign w:val="top"/>
-          </w:tcPr>
-          <w:p>
-            <w:pPr>
-              <w:jc w:val="center"/>
-              <w:pBdr>
-                <w:bottom w:val="none" w:sz="0" w:space="0" w:color="000000"/>
-                <w:top w:val="none" w:sz="0" w:space="0" w:color="000000"/>
-                <w:left w:val="none" w:sz="0" w:space="0" w:color="000000"/>
-                <w:right w:val="none" w:sz="0" w:space="0" w:color="000000"/>
-              </w:pBdr>
-              <w:spacing w:after="100" w:before="100" w:line="240"/>
-              <w:ind w:left="100" w:right="100" w:firstLine="0" w:firstLineChars="0"/>
-              <w:rPr>
-                <w:rFonts w:ascii="Arial" w:hAnsi="Arial" w:eastAsia="Arial" w:cs="Arial"/>
-                <w:i w:val="false"/>
-                <w:b w:val="false"/>
-                <w:u w:val="none"/>
-                <w:strike w:val="false"/>
-                <w:sz w:val="22"/>
-                <w:szCs w:val="22"/>
-                <w:color w:val="000000"/>
-              </w:rPr>
-            </w:pPr>
-            <w:r>
-              <w:rPr>
-                <w:rFonts w:ascii="Arial" w:hAnsi="Arial" w:eastAsia="Arial" w:cs="Arial"/>
-                <w:i w:val="false"/>
-                <w:b w:val="false"/>
-                <w:u w:val="none"/>
-                <w:strike w:val="false"/>
-                <w:sz w:val="22"/>
-                <w:szCs w:val="22"/>
-                <w:color w:val="000000"/>
-              </w:rPr>
-              <w:t xml:space="preserve">60 (23%)</w:t>
+              <w:t xml:space="preserve">668 (34%)</w:t>
+            </w:r>
+          </w:p>
+        </w:tc>
+        <w:tc>
+          <w:tcPr>
+            <w:tcBorders>
+              <w:bottom w:val="none" w:sz="0" w:space="0" w:color="000000"/>
+              <w:top w:val="none" w:sz="0" w:space="0" w:color="000000"/>
+              <w:left w:val="none" w:sz="0" w:space="0" w:color="000000"/>
+              <w:right w:val="none" w:sz="0" w:space="0" w:color="000000"/>
+            </w:tcBorders>
+            <w:shd w:val="clear" w:color="auto" w:fill="FFFFFF"/>
+            <w:tcMar>
+              <w:top w:w="0" w:type="dxa"/>
+              <w:bottom w:w="0" w:type="dxa"/>
+              <w:left w:w="0" w:type="dxa"/>
+              <w:right w:w="0" w:type="dxa"/>
+            </w:tcMar>
+            <w:vAlign w:val="top"/>
+          </w:tcPr>
+          <w:p>
+            <w:pPr>
+              <w:jc w:val="center"/>
+              <w:pBdr>
+                <w:bottom w:val="none" w:sz="0" w:space="0" w:color="000000"/>
+                <w:top w:val="none" w:sz="0" w:space="0" w:color="000000"/>
+                <w:left w:val="none" w:sz="0" w:space="0" w:color="000000"/>
+                <w:right w:val="none" w:sz="0" w:space="0" w:color="000000"/>
+              </w:pBdr>
+              <w:spacing w:after="100" w:before="100" w:line="240"/>
+              <w:ind w:left="100" w:right="100" w:firstLine="0" w:firstLineChars="0"/>
+              <w:rPr>
+                <w:rFonts w:ascii="Arial" w:hAnsi="Arial" w:eastAsia="Arial" w:cs="Arial"/>
+                <w:i w:val="false"/>
+                <w:b w:val="false"/>
+                <w:u w:val="none"/>
+                <w:strike w:val="false"/>
+                <w:sz w:val="22"/>
+                <w:szCs w:val="22"/>
+                <w:color w:val="000000"/>
+              </w:rPr>
+            </w:pPr>
+            <w:r>
+              <w:rPr>
+                <w:rFonts w:ascii="Arial" w:hAnsi="Arial" w:eastAsia="Arial" w:cs="Arial"/>
+                <w:i w:val="false"/>
+                <w:b w:val="false"/>
+                <w:u w:val="none"/>
+                <w:strike w:val="false"/>
+                <w:sz w:val="22"/>
+                <w:szCs w:val="22"/>
+                <w:color w:val="000000"/>
+              </w:rPr>
+              <w:t xml:space="preserve">59 (23%)</w:t>
             </w:r>
           </w:p>
         </w:tc>
@@ -11418,61 +11418,61 @@
                 <w:szCs w:val="22"/>
                 <w:color w:val="000000"/>
               </w:rPr>
-              <w:t xml:space="preserve">733 (37%)</w:t>
-            </w:r>
-          </w:p>
-        </w:tc>
-        <w:tc>
-          <w:tcPr>
-            <w:tcBorders>
-              <w:bottom w:val="none" w:sz="0" w:space="0" w:color="000000"/>
-              <w:top w:val="none" w:sz="0" w:space="0" w:color="000000"/>
-              <w:left w:val="none" w:sz="0" w:space="0" w:color="000000"/>
-              <w:right w:val="none" w:sz="0" w:space="0" w:color="000000"/>
-            </w:tcBorders>
-            <w:shd w:val="clear" w:color="auto" w:fill="FFFFFF"/>
-            <w:tcMar>
-              <w:top w:w="0" w:type="dxa"/>
-              <w:bottom w:w="0" w:type="dxa"/>
-              <w:left w:w="0" w:type="dxa"/>
-              <w:right w:w="0" w:type="dxa"/>
-            </w:tcMar>
-            <w:vAlign w:val="top"/>
-          </w:tcPr>
-          <w:p>
-            <w:pPr>
-              <w:jc w:val="center"/>
-              <w:pBdr>
-                <w:bottom w:val="none" w:sz="0" w:space="0" w:color="000000"/>
-                <w:top w:val="none" w:sz="0" w:space="0" w:color="000000"/>
-                <w:left w:val="none" w:sz="0" w:space="0" w:color="000000"/>
-                <w:right w:val="none" w:sz="0" w:space="0" w:color="000000"/>
-              </w:pBdr>
-              <w:spacing w:after="100" w:before="100" w:line="240"/>
-              <w:ind w:left="100" w:right="100" w:firstLine="0" w:firstLineChars="0"/>
-              <w:rPr>
-                <w:rFonts w:ascii="Arial" w:hAnsi="Arial" w:eastAsia="Arial" w:cs="Arial"/>
-                <w:i w:val="false"/>
-                <w:b w:val="false"/>
-                <w:u w:val="none"/>
-                <w:strike w:val="false"/>
-                <w:sz w:val="22"/>
-                <w:szCs w:val="22"/>
-                <w:color w:val="000000"/>
-              </w:rPr>
-            </w:pPr>
-            <w:r>
-              <w:rPr>
-                <w:rFonts w:ascii="Arial" w:hAnsi="Arial" w:eastAsia="Arial" w:cs="Arial"/>
-                <w:i w:val="false"/>
-                <w:b w:val="false"/>
-                <w:u w:val="none"/>
-                <w:strike w:val="false"/>
-                <w:sz w:val="22"/>
-                <w:szCs w:val="22"/>
-                <w:color w:val="000000"/>
-              </w:rPr>
-              <w:t xml:space="preserve">117 (44%)</w:t>
+              <w:t xml:space="preserve">737 (38%)</w:t>
+            </w:r>
+          </w:p>
+        </w:tc>
+        <w:tc>
+          <w:tcPr>
+            <w:tcBorders>
+              <w:bottom w:val="none" w:sz="0" w:space="0" w:color="000000"/>
+              <w:top w:val="none" w:sz="0" w:space="0" w:color="000000"/>
+              <w:left w:val="none" w:sz="0" w:space="0" w:color="000000"/>
+              <w:right w:val="none" w:sz="0" w:space="0" w:color="000000"/>
+            </w:tcBorders>
+            <w:shd w:val="clear" w:color="auto" w:fill="FFFFFF"/>
+            <w:tcMar>
+              <w:top w:w="0" w:type="dxa"/>
+              <w:bottom w:w="0" w:type="dxa"/>
+              <w:left w:w="0" w:type="dxa"/>
+              <w:right w:w="0" w:type="dxa"/>
+            </w:tcMar>
+            <w:vAlign w:val="top"/>
+          </w:tcPr>
+          <w:p>
+            <w:pPr>
+              <w:jc w:val="center"/>
+              <w:pBdr>
+                <w:bottom w:val="none" w:sz="0" w:space="0" w:color="000000"/>
+                <w:top w:val="none" w:sz="0" w:space="0" w:color="000000"/>
+                <w:left w:val="none" w:sz="0" w:space="0" w:color="000000"/>
+                <w:right w:val="none" w:sz="0" w:space="0" w:color="000000"/>
+              </w:pBdr>
+              <w:spacing w:after="100" w:before="100" w:line="240"/>
+              <w:ind w:left="100" w:right="100" w:firstLine="0" w:firstLineChars="0"/>
+              <w:rPr>
+                <w:rFonts w:ascii="Arial" w:hAnsi="Arial" w:eastAsia="Arial" w:cs="Arial"/>
+                <w:i w:val="false"/>
+                <w:b w:val="false"/>
+                <w:u w:val="none"/>
+                <w:strike w:val="false"/>
+                <w:sz w:val="22"/>
+                <w:szCs w:val="22"/>
+                <w:color w:val="000000"/>
+              </w:rPr>
+            </w:pPr>
+            <w:r>
+              <w:rPr>
+                <w:rFonts w:ascii="Arial" w:hAnsi="Arial" w:eastAsia="Arial" w:cs="Arial"/>
+                <w:i w:val="false"/>
+                <w:b w:val="false"/>
+                <w:u w:val="none"/>
+                <w:strike w:val="false"/>
+                <w:sz w:val="22"/>
+                <w:szCs w:val="22"/>
+                <w:color w:val="000000"/>
+              </w:rPr>
+              <w:t xml:space="preserve">113 (43%)</w:t>
             </w:r>
           </w:p>
         </w:tc>
@@ -12300,7 +12300,7 @@
                 <w:szCs w:val="22"/>
                 <w:color w:val="000000"/>
               </w:rPr>
-              <w:t xml:space="preserve">23 (8.6%)</w:t>
+              <w:t xml:space="preserve">23 (8.8%)</w:t>
             </w:r>
           </w:p>
         </w:tc>
@@ -12522,61 +12522,61 @@
                 <w:szCs w:val="22"/>
                 <w:color w:val="000000"/>
               </w:rPr>
-              <w:t xml:space="preserve">148 (7.6%)</w:t>
-            </w:r>
-          </w:p>
-        </w:tc>
-        <w:tc>
-          <w:tcPr>
-            <w:tcBorders>
-              <w:bottom w:val="none" w:sz="0" w:space="0" w:color="000000"/>
-              <w:top w:val="none" w:sz="0" w:space="0" w:color="000000"/>
-              <w:left w:val="none" w:sz="0" w:space="0" w:color="000000"/>
-              <w:right w:val="none" w:sz="0" w:space="0" w:color="000000"/>
-            </w:tcBorders>
-            <w:shd w:val="clear" w:color="auto" w:fill="FFFFFF"/>
-            <w:tcMar>
-              <w:top w:w="0" w:type="dxa"/>
-              <w:bottom w:w="0" w:type="dxa"/>
-              <w:left w:w="0" w:type="dxa"/>
-              <w:right w:w="0" w:type="dxa"/>
-            </w:tcMar>
-            <w:vAlign w:val="top"/>
-          </w:tcPr>
-          <w:p>
-            <w:pPr>
-              <w:jc w:val="center"/>
-              <w:pBdr>
-                <w:bottom w:val="none" w:sz="0" w:space="0" w:color="000000"/>
-                <w:top w:val="none" w:sz="0" w:space="0" w:color="000000"/>
-                <w:left w:val="none" w:sz="0" w:space="0" w:color="000000"/>
-                <w:right w:val="none" w:sz="0" w:space="0" w:color="000000"/>
-              </w:pBdr>
-              <w:spacing w:after="100" w:before="100" w:line="240"/>
-              <w:ind w:left="100" w:right="100" w:firstLine="0" w:firstLineChars="0"/>
-              <w:rPr>
-                <w:rFonts w:ascii="Arial" w:hAnsi="Arial" w:eastAsia="Arial" w:cs="Arial"/>
-                <w:i w:val="false"/>
-                <w:b w:val="false"/>
-                <w:u w:val="none"/>
-                <w:strike w:val="false"/>
-                <w:sz w:val="22"/>
-                <w:szCs w:val="22"/>
-                <w:color w:val="000000"/>
-              </w:rPr>
-            </w:pPr>
-            <w:r>
-              <w:rPr>
-                <w:rFonts w:ascii="Arial" w:hAnsi="Arial" w:eastAsia="Arial" w:cs="Arial"/>
-                <w:i w:val="false"/>
-                <w:b w:val="false"/>
-                <w:u w:val="none"/>
-                <w:strike w:val="false"/>
-                <w:sz w:val="22"/>
-                <w:szCs w:val="22"/>
-                <w:color w:val="000000"/>
-              </w:rPr>
-              <w:t xml:space="preserve">24 (9.0%)</w:t>
+              <w:t xml:space="preserve">149 (7.6%)</w:t>
+            </w:r>
+          </w:p>
+        </w:tc>
+        <w:tc>
+          <w:tcPr>
+            <w:tcBorders>
+              <w:bottom w:val="none" w:sz="0" w:space="0" w:color="000000"/>
+              <w:top w:val="none" w:sz="0" w:space="0" w:color="000000"/>
+              <w:left w:val="none" w:sz="0" w:space="0" w:color="000000"/>
+              <w:right w:val="none" w:sz="0" w:space="0" w:color="000000"/>
+            </w:tcBorders>
+            <w:shd w:val="clear" w:color="auto" w:fill="FFFFFF"/>
+            <w:tcMar>
+              <w:top w:w="0" w:type="dxa"/>
+              <w:bottom w:w="0" w:type="dxa"/>
+              <w:left w:w="0" w:type="dxa"/>
+              <w:right w:w="0" w:type="dxa"/>
+            </w:tcMar>
+            <w:vAlign w:val="top"/>
+          </w:tcPr>
+          <w:p>
+            <w:pPr>
+              <w:jc w:val="center"/>
+              <w:pBdr>
+                <w:bottom w:val="none" w:sz="0" w:space="0" w:color="000000"/>
+                <w:top w:val="none" w:sz="0" w:space="0" w:color="000000"/>
+                <w:left w:val="none" w:sz="0" w:space="0" w:color="000000"/>
+                <w:right w:val="none" w:sz="0" w:space="0" w:color="000000"/>
+              </w:pBdr>
+              <w:spacing w:after="100" w:before="100" w:line="240"/>
+              <w:ind w:left="100" w:right="100" w:firstLine="0" w:firstLineChars="0"/>
+              <w:rPr>
+                <w:rFonts w:ascii="Arial" w:hAnsi="Arial" w:eastAsia="Arial" w:cs="Arial"/>
+                <w:i w:val="false"/>
+                <w:b w:val="false"/>
+                <w:u w:val="none"/>
+                <w:strike w:val="false"/>
+                <w:sz w:val="22"/>
+                <w:szCs w:val="22"/>
+                <w:color w:val="000000"/>
+              </w:rPr>
+            </w:pPr>
+            <w:r>
+              <w:rPr>
+                <w:rFonts w:ascii="Arial" w:hAnsi="Arial" w:eastAsia="Arial" w:cs="Arial"/>
+                <w:i w:val="false"/>
+                <w:b w:val="false"/>
+                <w:u w:val="none"/>
+                <w:strike w:val="false"/>
+                <w:sz w:val="22"/>
+                <w:szCs w:val="22"/>
+                <w:color w:val="000000"/>
+              </w:rPr>
+              <w:t xml:space="preserve">23 (8.8%)</w:t>
             </w:r>
           </w:p>
         </w:tc>
@@ -12798,61 +12798,61 @@
                 <w:szCs w:val="22"/>
                 <w:color w:val="000000"/>
               </w:rPr>
-              <w:t xml:space="preserve">190 (9.7%)</w:t>
-            </w:r>
-          </w:p>
-        </w:tc>
-        <w:tc>
-          <w:tcPr>
-            <w:tcBorders>
-              <w:bottom w:val="none" w:sz="0" w:space="0" w:color="000000"/>
-              <w:top w:val="none" w:sz="0" w:space="0" w:color="000000"/>
-              <w:left w:val="none" w:sz="0" w:space="0" w:color="000000"/>
-              <w:right w:val="none" w:sz="0" w:space="0" w:color="000000"/>
-            </w:tcBorders>
-            <w:shd w:val="clear" w:color="auto" w:fill="FFFFFF"/>
-            <w:tcMar>
-              <w:top w:w="0" w:type="dxa"/>
-              <w:bottom w:w="0" w:type="dxa"/>
-              <w:left w:w="0" w:type="dxa"/>
-              <w:right w:w="0" w:type="dxa"/>
-            </w:tcMar>
-            <w:vAlign w:val="top"/>
-          </w:tcPr>
-          <w:p>
-            <w:pPr>
-              <w:jc w:val="center"/>
-              <w:pBdr>
-                <w:bottom w:val="none" w:sz="0" w:space="0" w:color="000000"/>
-                <w:top w:val="none" w:sz="0" w:space="0" w:color="000000"/>
-                <w:left w:val="none" w:sz="0" w:space="0" w:color="000000"/>
-                <w:right w:val="none" w:sz="0" w:space="0" w:color="000000"/>
-              </w:pBdr>
-              <w:spacing w:after="100" w:before="100" w:line="240"/>
-              <w:ind w:left="100" w:right="100" w:firstLine="0" w:firstLineChars="0"/>
-              <w:rPr>
-                <w:rFonts w:ascii="Arial" w:hAnsi="Arial" w:eastAsia="Arial" w:cs="Arial"/>
-                <w:i w:val="false"/>
-                <w:b w:val="false"/>
-                <w:u w:val="none"/>
-                <w:strike w:val="false"/>
-                <w:sz w:val="22"/>
-                <w:szCs w:val="22"/>
-                <w:color w:val="000000"/>
-              </w:rPr>
-            </w:pPr>
-            <w:r>
-              <w:rPr>
-                <w:rFonts w:ascii="Arial" w:hAnsi="Arial" w:eastAsia="Arial" w:cs="Arial"/>
-                <w:i w:val="false"/>
-                <w:b w:val="false"/>
-                <w:u w:val="none"/>
-                <w:strike w:val="false"/>
-                <w:sz w:val="22"/>
-                <w:szCs w:val="22"/>
-                <w:color w:val="000000"/>
-              </w:rPr>
-              <w:t xml:space="preserve">19 (7.1%)</w:t>
+              <w:t xml:space="preserve">192 (9.8%)</w:t>
+            </w:r>
+          </w:p>
+        </w:tc>
+        <w:tc>
+          <w:tcPr>
+            <w:tcBorders>
+              <w:bottom w:val="none" w:sz="0" w:space="0" w:color="000000"/>
+              <w:top w:val="none" w:sz="0" w:space="0" w:color="000000"/>
+              <w:left w:val="none" w:sz="0" w:space="0" w:color="000000"/>
+              <w:right w:val="none" w:sz="0" w:space="0" w:color="000000"/>
+            </w:tcBorders>
+            <w:shd w:val="clear" w:color="auto" w:fill="FFFFFF"/>
+            <w:tcMar>
+              <w:top w:w="0" w:type="dxa"/>
+              <w:bottom w:w="0" w:type="dxa"/>
+              <w:left w:w="0" w:type="dxa"/>
+              <w:right w:w="0" w:type="dxa"/>
+            </w:tcMar>
+            <w:vAlign w:val="top"/>
+          </w:tcPr>
+          <w:p>
+            <w:pPr>
+              <w:jc w:val="center"/>
+              <w:pBdr>
+                <w:bottom w:val="none" w:sz="0" w:space="0" w:color="000000"/>
+                <w:top w:val="none" w:sz="0" w:space="0" w:color="000000"/>
+                <w:left w:val="none" w:sz="0" w:space="0" w:color="000000"/>
+                <w:right w:val="none" w:sz="0" w:space="0" w:color="000000"/>
+              </w:pBdr>
+              <w:spacing w:after="100" w:before="100" w:line="240"/>
+              <w:ind w:left="100" w:right="100" w:firstLine="0" w:firstLineChars="0"/>
+              <w:rPr>
+                <w:rFonts w:ascii="Arial" w:hAnsi="Arial" w:eastAsia="Arial" w:cs="Arial"/>
+                <w:i w:val="false"/>
+                <w:b w:val="false"/>
+                <w:u w:val="none"/>
+                <w:strike w:val="false"/>
+                <w:sz w:val="22"/>
+                <w:szCs w:val="22"/>
+                <w:color w:val="000000"/>
+              </w:rPr>
+            </w:pPr>
+            <w:r>
+              <w:rPr>
+                <w:rFonts w:ascii="Arial" w:hAnsi="Arial" w:eastAsia="Arial" w:cs="Arial"/>
+                <w:i w:val="false"/>
+                <w:b w:val="false"/>
+                <w:u w:val="none"/>
+                <w:strike w:val="false"/>
+                <w:sz w:val="22"/>
+                <w:szCs w:val="22"/>
+                <w:color w:val="000000"/>
+              </w:rPr>
+              <w:t xml:space="preserve">17 (6.5%)</w:t>
             </w:r>
           </w:p>
         </w:tc>
@@ -13074,61 +13074,61 @@
                 <w:szCs w:val="22"/>
                 <w:color w:val="000000"/>
               </w:rPr>
-              <w:t xml:space="preserve">138 (7.1%)</w:t>
-            </w:r>
-          </w:p>
-        </w:tc>
-        <w:tc>
-          <w:tcPr>
-            <w:tcBorders>
-              <w:bottom w:val="none" w:sz="0" w:space="0" w:color="000000"/>
-              <w:top w:val="none" w:sz="0" w:space="0" w:color="000000"/>
-              <w:left w:val="none" w:sz="0" w:space="0" w:color="000000"/>
-              <w:right w:val="none" w:sz="0" w:space="0" w:color="000000"/>
-            </w:tcBorders>
-            <w:shd w:val="clear" w:color="auto" w:fill="FFFFFF"/>
-            <w:tcMar>
-              <w:top w:w="0" w:type="dxa"/>
-              <w:bottom w:w="0" w:type="dxa"/>
-              <w:left w:w="0" w:type="dxa"/>
-              <w:right w:w="0" w:type="dxa"/>
-            </w:tcMar>
-            <w:vAlign w:val="top"/>
-          </w:tcPr>
-          <w:p>
-            <w:pPr>
-              <w:jc w:val="center"/>
-              <w:pBdr>
-                <w:bottom w:val="none" w:sz="0" w:space="0" w:color="000000"/>
-                <w:top w:val="none" w:sz="0" w:space="0" w:color="000000"/>
-                <w:left w:val="none" w:sz="0" w:space="0" w:color="000000"/>
-                <w:right w:val="none" w:sz="0" w:space="0" w:color="000000"/>
-              </w:pBdr>
-              <w:spacing w:after="100" w:before="100" w:line="240"/>
-              <w:ind w:left="100" w:right="100" w:firstLine="0" w:firstLineChars="0"/>
-              <w:rPr>
-                <w:rFonts w:ascii="Arial" w:hAnsi="Arial" w:eastAsia="Arial" w:cs="Arial"/>
-                <w:i w:val="false"/>
-                <w:b w:val="false"/>
-                <w:u w:val="none"/>
-                <w:strike w:val="false"/>
-                <w:sz w:val="22"/>
-                <w:szCs w:val="22"/>
-                <w:color w:val="000000"/>
-              </w:rPr>
-            </w:pPr>
-            <w:r>
-              <w:rPr>
-                <w:rFonts w:ascii="Arial" w:hAnsi="Arial" w:eastAsia="Arial" w:cs="Arial"/>
-                <w:i w:val="false"/>
-                <w:b w:val="false"/>
-                <w:u w:val="none"/>
-                <w:strike w:val="false"/>
-                <w:sz w:val="22"/>
-                <w:szCs w:val="22"/>
-                <w:color w:val="000000"/>
-              </w:rPr>
-              <w:t xml:space="preserve">12 (4.5%)</w:t>
+              <w:t xml:space="preserve">138 (7.0%)</w:t>
+            </w:r>
+          </w:p>
+        </w:tc>
+        <w:tc>
+          <w:tcPr>
+            <w:tcBorders>
+              <w:bottom w:val="none" w:sz="0" w:space="0" w:color="000000"/>
+              <w:top w:val="none" w:sz="0" w:space="0" w:color="000000"/>
+              <w:left w:val="none" w:sz="0" w:space="0" w:color="000000"/>
+              <w:right w:val="none" w:sz="0" w:space="0" w:color="000000"/>
+            </w:tcBorders>
+            <w:shd w:val="clear" w:color="auto" w:fill="FFFFFF"/>
+            <w:tcMar>
+              <w:top w:w="0" w:type="dxa"/>
+              <w:bottom w:w="0" w:type="dxa"/>
+              <w:left w:w="0" w:type="dxa"/>
+              <w:right w:w="0" w:type="dxa"/>
+            </w:tcMar>
+            <w:vAlign w:val="top"/>
+          </w:tcPr>
+          <w:p>
+            <w:pPr>
+              <w:jc w:val="center"/>
+              <w:pBdr>
+                <w:bottom w:val="none" w:sz="0" w:space="0" w:color="000000"/>
+                <w:top w:val="none" w:sz="0" w:space="0" w:color="000000"/>
+                <w:left w:val="none" w:sz="0" w:space="0" w:color="000000"/>
+                <w:right w:val="none" w:sz="0" w:space="0" w:color="000000"/>
+              </w:pBdr>
+              <w:spacing w:after="100" w:before="100" w:line="240"/>
+              <w:ind w:left="100" w:right="100" w:firstLine="0" w:firstLineChars="0"/>
+              <w:rPr>
+                <w:rFonts w:ascii="Arial" w:hAnsi="Arial" w:eastAsia="Arial" w:cs="Arial"/>
+                <w:i w:val="false"/>
+                <w:b w:val="false"/>
+                <w:u w:val="none"/>
+                <w:strike w:val="false"/>
+                <w:sz w:val="22"/>
+                <w:szCs w:val="22"/>
+                <w:color w:val="000000"/>
+              </w:rPr>
+            </w:pPr>
+            <w:r>
+              <w:rPr>
+                <w:rFonts w:ascii="Arial" w:hAnsi="Arial" w:eastAsia="Arial" w:cs="Arial"/>
+                <w:i w:val="false"/>
+                <w:b w:val="false"/>
+                <w:u w:val="none"/>
+                <w:strike w:val="false"/>
+                <w:sz w:val="22"/>
+                <w:szCs w:val="22"/>
+                <w:color w:val="000000"/>
+              </w:rPr>
+              <w:t xml:space="preserve">12 (4.6%)</w:t>
             </w:r>
           </w:p>
         </w:tc>
@@ -13680,7 +13680,7 @@
                 <w:szCs w:val="22"/>
                 <w:color w:val="000000"/>
               </w:rPr>
-              <w:t xml:space="preserve">41 (15%)</w:t>
+              <w:t xml:space="preserve">41 (16%)</w:t>
             </w:r>
           </w:p>
         </w:tc>
@@ -14178,61 +14178,61 @@
                 <w:szCs w:val="22"/>
                 <w:color w:val="000000"/>
               </w:rPr>
-              <w:t xml:space="preserve">310 (16%)</w:t>
-            </w:r>
-          </w:p>
-        </w:tc>
-        <w:tc>
-          <w:tcPr>
-            <w:tcBorders>
-              <w:bottom w:val="none" w:sz="0" w:space="0" w:color="000000"/>
-              <w:top w:val="none" w:sz="0" w:space="0" w:color="000000"/>
-              <w:left w:val="none" w:sz="0" w:space="0" w:color="000000"/>
-              <w:right w:val="none" w:sz="0" w:space="0" w:color="000000"/>
-            </w:tcBorders>
-            <w:shd w:val="clear" w:color="auto" w:fill="FFFFFF"/>
-            <w:tcMar>
-              <w:top w:w="0" w:type="dxa"/>
-              <w:bottom w:w="0" w:type="dxa"/>
-              <w:left w:w="0" w:type="dxa"/>
-              <w:right w:w="0" w:type="dxa"/>
-            </w:tcMar>
-            <w:vAlign w:val="top"/>
-          </w:tcPr>
-          <w:p>
-            <w:pPr>
-              <w:jc w:val="center"/>
-              <w:pBdr>
-                <w:bottom w:val="none" w:sz="0" w:space="0" w:color="000000"/>
-                <w:top w:val="none" w:sz="0" w:space="0" w:color="000000"/>
-                <w:left w:val="none" w:sz="0" w:space="0" w:color="000000"/>
-                <w:right w:val="none" w:sz="0" w:space="0" w:color="000000"/>
-              </w:pBdr>
-              <w:spacing w:after="100" w:before="100" w:line="240"/>
-              <w:ind w:left="100" w:right="100" w:firstLine="0" w:firstLineChars="0"/>
-              <w:rPr>
-                <w:rFonts w:ascii="Arial" w:hAnsi="Arial" w:eastAsia="Arial" w:cs="Arial"/>
-                <w:i w:val="false"/>
-                <w:b w:val="false"/>
-                <w:u w:val="none"/>
-                <w:strike w:val="false"/>
-                <w:sz w:val="22"/>
-                <w:szCs w:val="22"/>
-                <w:color w:val="000000"/>
-              </w:rPr>
-            </w:pPr>
-            <w:r>
-              <w:rPr>
-                <w:rFonts w:ascii="Arial" w:hAnsi="Arial" w:eastAsia="Arial" w:cs="Arial"/>
-                <w:i w:val="false"/>
-                <w:b w:val="false"/>
-                <w:u w:val="none"/>
-                <w:strike w:val="false"/>
-                <w:sz w:val="22"/>
-                <w:szCs w:val="22"/>
-                <w:color w:val="000000"/>
-              </w:rPr>
-              <w:t xml:space="preserve">50 (19%)</w:t>
+              <w:t xml:space="preserve">311 (16%)</w:t>
+            </w:r>
+          </w:p>
+        </w:tc>
+        <w:tc>
+          <w:tcPr>
+            <w:tcBorders>
+              <w:bottom w:val="none" w:sz="0" w:space="0" w:color="000000"/>
+              <w:top w:val="none" w:sz="0" w:space="0" w:color="000000"/>
+              <w:left w:val="none" w:sz="0" w:space="0" w:color="000000"/>
+              <w:right w:val="none" w:sz="0" w:space="0" w:color="000000"/>
+            </w:tcBorders>
+            <w:shd w:val="clear" w:color="auto" w:fill="FFFFFF"/>
+            <w:tcMar>
+              <w:top w:w="0" w:type="dxa"/>
+              <w:bottom w:w="0" w:type="dxa"/>
+              <w:left w:w="0" w:type="dxa"/>
+              <w:right w:w="0" w:type="dxa"/>
+            </w:tcMar>
+            <w:vAlign w:val="top"/>
+          </w:tcPr>
+          <w:p>
+            <w:pPr>
+              <w:jc w:val="center"/>
+              <w:pBdr>
+                <w:bottom w:val="none" w:sz="0" w:space="0" w:color="000000"/>
+                <w:top w:val="none" w:sz="0" w:space="0" w:color="000000"/>
+                <w:left w:val="none" w:sz="0" w:space="0" w:color="000000"/>
+                <w:right w:val="none" w:sz="0" w:space="0" w:color="000000"/>
+              </w:pBdr>
+              <w:spacing w:after="100" w:before="100" w:line="240"/>
+              <w:ind w:left="100" w:right="100" w:firstLine="0" w:firstLineChars="0"/>
+              <w:rPr>
+                <w:rFonts w:ascii="Arial" w:hAnsi="Arial" w:eastAsia="Arial" w:cs="Arial"/>
+                <w:i w:val="false"/>
+                <w:b w:val="false"/>
+                <w:u w:val="none"/>
+                <w:strike w:val="false"/>
+                <w:sz w:val="22"/>
+                <w:szCs w:val="22"/>
+                <w:color w:val="000000"/>
+              </w:rPr>
+            </w:pPr>
+            <w:r>
+              <w:rPr>
+                <w:rFonts w:ascii="Arial" w:hAnsi="Arial" w:eastAsia="Arial" w:cs="Arial"/>
+                <w:i w:val="false"/>
+                <w:b w:val="false"/>
+                <w:u w:val="none"/>
+                <w:strike w:val="false"/>
+                <w:sz w:val="22"/>
+                <w:szCs w:val="22"/>
+                <w:color w:val="000000"/>
+              </w:rPr>
+              <w:t xml:space="preserve">49 (19%)</w:t>
             </w:r>
           </w:p>
         </w:tc>
@@ -14454,61 +14454,61 @@
                 <w:szCs w:val="22"/>
                 <w:color w:val="000000"/>
               </w:rPr>
-              <w:t xml:space="preserve">306 (16%)</w:t>
-            </w:r>
-          </w:p>
-        </w:tc>
-        <w:tc>
-          <w:tcPr>
-            <w:tcBorders>
-              <w:bottom w:val="none" w:sz="0" w:space="0" w:color="000000"/>
-              <w:top w:val="none" w:sz="0" w:space="0" w:color="000000"/>
-              <w:left w:val="none" w:sz="0" w:space="0" w:color="000000"/>
-              <w:right w:val="none" w:sz="0" w:space="0" w:color="000000"/>
-            </w:tcBorders>
-            <w:shd w:val="clear" w:color="auto" w:fill="FFFFFF"/>
-            <w:tcMar>
-              <w:top w:w="0" w:type="dxa"/>
-              <w:bottom w:w="0" w:type="dxa"/>
-              <w:left w:w="0" w:type="dxa"/>
-              <w:right w:w="0" w:type="dxa"/>
-            </w:tcMar>
-            <w:vAlign w:val="top"/>
-          </w:tcPr>
-          <w:p>
-            <w:pPr>
-              <w:jc w:val="center"/>
-              <w:pBdr>
-                <w:bottom w:val="none" w:sz="0" w:space="0" w:color="000000"/>
-                <w:top w:val="none" w:sz="0" w:space="0" w:color="000000"/>
-                <w:left w:val="none" w:sz="0" w:space="0" w:color="000000"/>
-                <w:right w:val="none" w:sz="0" w:space="0" w:color="000000"/>
-              </w:pBdr>
-              <w:spacing w:after="100" w:before="100" w:line="240"/>
-              <w:ind w:left="100" w:right="100" w:firstLine="0" w:firstLineChars="0"/>
-              <w:rPr>
-                <w:rFonts w:ascii="Arial" w:hAnsi="Arial" w:eastAsia="Arial" w:cs="Arial"/>
-                <w:i w:val="false"/>
-                <w:b w:val="false"/>
-                <w:u w:val="none"/>
-                <w:strike w:val="false"/>
-                <w:sz w:val="22"/>
-                <w:szCs w:val="22"/>
-                <w:color w:val="000000"/>
-              </w:rPr>
-            </w:pPr>
-            <w:r>
-              <w:rPr>
-                <w:rFonts w:ascii="Arial" w:hAnsi="Arial" w:eastAsia="Arial" w:cs="Arial"/>
-                <w:i w:val="false"/>
-                <w:b w:val="false"/>
-                <w:u w:val="none"/>
-                <w:strike w:val="false"/>
-                <w:sz w:val="22"/>
-                <w:szCs w:val="22"/>
-                <w:color w:val="000000"/>
-              </w:rPr>
-              <w:t xml:space="preserve">47 (18%)</w:t>
+              <w:t xml:space="preserve">308 (16%)</w:t>
+            </w:r>
+          </w:p>
+        </w:tc>
+        <w:tc>
+          <w:tcPr>
+            <w:tcBorders>
+              <w:bottom w:val="none" w:sz="0" w:space="0" w:color="000000"/>
+              <w:top w:val="none" w:sz="0" w:space="0" w:color="000000"/>
+              <w:left w:val="none" w:sz="0" w:space="0" w:color="000000"/>
+              <w:right w:val="none" w:sz="0" w:space="0" w:color="000000"/>
+            </w:tcBorders>
+            <w:shd w:val="clear" w:color="auto" w:fill="FFFFFF"/>
+            <w:tcMar>
+              <w:top w:w="0" w:type="dxa"/>
+              <w:bottom w:w="0" w:type="dxa"/>
+              <w:left w:w="0" w:type="dxa"/>
+              <w:right w:w="0" w:type="dxa"/>
+            </w:tcMar>
+            <w:vAlign w:val="top"/>
+          </w:tcPr>
+          <w:p>
+            <w:pPr>
+              <w:jc w:val="center"/>
+              <w:pBdr>
+                <w:bottom w:val="none" w:sz="0" w:space="0" w:color="000000"/>
+                <w:top w:val="none" w:sz="0" w:space="0" w:color="000000"/>
+                <w:left w:val="none" w:sz="0" w:space="0" w:color="000000"/>
+                <w:right w:val="none" w:sz="0" w:space="0" w:color="000000"/>
+              </w:pBdr>
+              <w:spacing w:after="100" w:before="100" w:line="240"/>
+              <w:ind w:left="100" w:right="100" w:firstLine="0" w:firstLineChars="0"/>
+              <w:rPr>
+                <w:rFonts w:ascii="Arial" w:hAnsi="Arial" w:eastAsia="Arial" w:cs="Arial"/>
+                <w:i w:val="false"/>
+                <w:b w:val="false"/>
+                <w:u w:val="none"/>
+                <w:strike w:val="false"/>
+                <w:sz w:val="22"/>
+                <w:szCs w:val="22"/>
+                <w:color w:val="000000"/>
+              </w:rPr>
+            </w:pPr>
+            <w:r>
+              <w:rPr>
+                <w:rFonts w:ascii="Arial" w:hAnsi="Arial" w:eastAsia="Arial" w:cs="Arial"/>
+                <w:i w:val="false"/>
+                <w:b w:val="false"/>
+                <w:u w:val="none"/>
+                <w:strike w:val="false"/>
+                <w:sz w:val="22"/>
+                <w:szCs w:val="22"/>
+                <w:color w:val="000000"/>
+              </w:rPr>
+              <w:t xml:space="preserve">45 (17%)</w:t>
             </w:r>
           </w:p>
         </w:tc>
@@ -14784,7 +14784,7 @@
                 <w:szCs w:val="22"/>
                 <w:color w:val="000000"/>
               </w:rPr>
-              <w:t xml:space="preserve">22 (8.3%)</w:t>
+              <w:t xml:space="preserve">22 (8.5%)</w:t>
             </w:r>
           </w:p>
         </w:tc>
@@ -14913,7 +14913,7 @@
                 <w:szCs w:val="22"/>
                 <w:color w:val="000000"/>
               </w:rPr>
-              <w:t xml:space="preserve">"Excluded (CT)": co-detection partner CT &gt;30, missing, or inconclusive. Case dropped entirely (N=266). (All cases are already restricted to HMPV CT ≤30; see table caption.)</w:t>
+              <w:t xml:space="preserve">"Excluded (CT)": co-detection partner CT &gt;30, missing, or inconclusive. Case dropped entirely (N=260). (All cases are already restricted to HMPV CT ≤30; see table caption.)</w:t>
             </w:r>
           </w:p>
         </w:tc>

</xml_diff>